<commit_message>
DOCX: tighten page margins to 15mm + standardise all tables to 180mm
Matches the PDF layout — every body table now has the same outer
width (180mm), aligned with the section grey-header bar.

Co-Authored-By: Claude Opus 4.7 <noreply@anthropic.com>
</commit_message>
<xml_diff>
--- a/mockup/monthly_client_statement/sample-statements/Custody_Simplified_sample.docx
+++ b/mockup/monthly_client_statement/sample-statements/Custody_Simplified_sample.docx
@@ -121,12 +121,12 @@
         <w:tblLook w:firstColumn="1" w:firstRow="1" w:lastColumn="0" w:lastRow="0" w:noHBand="0" w:noVBand="1" w:val="04A0"/>
       </w:tblPr>
       <w:tblGrid>
-        <w:gridCol w:w="9866"/>
+        <w:gridCol w:w="10206"/>
       </w:tblGrid>
       <w:tr>
         <w:tc>
           <w:tcPr>
-            <w:tcW w:type="dxa" w:w="9866"/>
+            <w:tcW w:type="dxa" w:w="10206"/>
             <w:shd w:val="clear" w:color="auto" w:fill="C8CFD8"/>
             <w:tcBorders>
               <w:top w:val="nil"/>
@@ -164,7 +164,7 @@
       <w:tr>
         <w:tc>
           <w:tcPr>
-            <w:tcW w:type="dxa" w:w="9866"/>
+            <w:tcW w:type="dxa" w:w="10206"/>
             <w:shd w:val="clear" w:color="auto" w:fill="C8CFD8"/>
             <w:tcBorders>
               <w:top w:val="nil"/>
@@ -589,9 +589,9 @@
         <w:tblLook w:firstColumn="1" w:firstRow="1" w:lastColumn="0" w:lastRow="0" w:noHBand="0" w:noVBand="1" w:val="04A0"/>
       </w:tblPr>
       <w:tblGrid>
-        <w:gridCol w:w="1984"/>
-        <w:gridCol w:w="3118"/>
-        <w:gridCol w:w="4762"/>
+        <w:gridCol w:w="2041"/>
+        <w:gridCol w:w="3231"/>
+        <w:gridCol w:w="4932"/>
       </w:tblGrid>
       <w:tr>
         <w:trPr>
@@ -599,7 +599,7 @@
         </w:trPr>
         <w:tc>
           <w:tcPr>
-            <w:tcW w:type="dxa" w:w="1984"/>
+            <w:tcW w:type="dxa" w:w="2041"/>
             <w:shd w:val="clear" w:color="auto" w:fill="0A2342"/>
             <w:tcBorders>
               <w:top w:val="nil"/>
@@ -633,7 +633,7 @@
         </w:tc>
         <w:tc>
           <w:tcPr>
-            <w:tcW w:type="dxa" w:w="3118"/>
+            <w:tcW w:type="dxa" w:w="3231"/>
             <w:shd w:val="clear" w:color="auto" w:fill="0A2342"/>
             <w:tcBorders>
               <w:top w:val="nil"/>
@@ -668,7 +668,7 @@
         </w:tc>
         <w:tc>
           <w:tcPr>
-            <w:tcW w:type="dxa" w:w="4762"/>
+            <w:tcW w:type="dxa" w:w="4932"/>
             <w:shd w:val="clear" w:color="auto" w:fill="0A2342"/>
             <w:tcBorders>
               <w:top w:val="nil"/>
@@ -706,7 +706,7 @@
       <w:tr>
         <w:tc>
           <w:tcPr>
-            <w:tcW w:type="dxa" w:w="1984"/>
+            <w:tcW w:type="dxa" w:w="2041"/>
             <w:tcBorders>
               <w:bottom w:val="single" w:sz="4" w:color="D0D5DD"/>
             </w:tcBorders>
@@ -731,7 +731,7 @@
         </w:tc>
         <w:tc>
           <w:tcPr>
-            <w:tcW w:type="dxa" w:w="3118"/>
+            <w:tcW w:type="dxa" w:w="3231"/>
             <w:tcBorders>
               <w:bottom w:val="single" w:sz="4" w:color="D0D5DD"/>
             </w:tcBorders>
@@ -756,7 +756,7 @@
         </w:tc>
         <w:tc>
           <w:tcPr>
-            <w:tcW w:type="dxa" w:w="4762"/>
+            <w:tcW w:type="dxa" w:w="4932"/>
             <w:tcBorders>
               <w:bottom w:val="single" w:sz="4" w:color="D0D5DD"/>
             </w:tcBorders>
@@ -784,7 +784,7 @@
       <w:tr>
         <w:tc>
           <w:tcPr>
-            <w:tcW w:type="dxa" w:w="1984"/>
+            <w:tcW w:type="dxa" w:w="2041"/>
             <w:shd w:val="clear" w:color="auto" w:fill="F5F7FA"/>
             <w:tcBorders>
               <w:bottom w:val="single" w:sz="4" w:color="D0D5DD"/>
@@ -810,7 +810,7 @@
         </w:tc>
         <w:tc>
           <w:tcPr>
-            <w:tcW w:type="dxa" w:w="3118"/>
+            <w:tcW w:type="dxa" w:w="3231"/>
             <w:shd w:val="clear" w:color="auto" w:fill="F5F7FA"/>
             <w:tcBorders>
               <w:bottom w:val="single" w:sz="4" w:color="D0D5DD"/>
@@ -836,7 +836,7 @@
         </w:tc>
         <w:tc>
           <w:tcPr>
-            <w:tcW w:type="dxa" w:w="4762"/>
+            <w:tcW w:type="dxa" w:w="4932"/>
             <w:shd w:val="clear" w:color="auto" w:fill="F5F7FA"/>
             <w:tcBorders>
               <w:bottom w:val="single" w:sz="4" w:color="D0D5DD"/>
@@ -865,7 +865,7 @@
       <w:tr>
         <w:tc>
           <w:tcPr>
-            <w:tcW w:type="dxa" w:w="1984"/>
+            <w:tcW w:type="dxa" w:w="2041"/>
             <w:tcBorders>
               <w:bottom w:val="single" w:sz="4" w:color="D0D5DD"/>
             </w:tcBorders>
@@ -890,7 +890,7 @@
         </w:tc>
         <w:tc>
           <w:tcPr>
-            <w:tcW w:type="dxa" w:w="3118"/>
+            <w:tcW w:type="dxa" w:w="3231"/>
             <w:tcBorders>
               <w:bottom w:val="single" w:sz="4" w:color="D0D5DD"/>
             </w:tcBorders>
@@ -915,7 +915,7 @@
         </w:tc>
         <w:tc>
           <w:tcPr>
-            <w:tcW w:type="dxa" w:w="4762"/>
+            <w:tcW w:type="dxa" w:w="4932"/>
             <w:tcBorders>
               <w:bottom w:val="single" w:sz="4" w:color="D0D5DD"/>
             </w:tcBorders>
@@ -945,7 +945,7 @@
       <w:pPr>
         <w:sectPr>
           <w:pgSz w:w="11906" w:h="16838"/>
-          <w:pgMar w:top="1134" w:right="1020" w:bottom="1134" w:left="1020" w:header="720" w:footer="720" w:gutter="0"/>
+          <w:pgMar w:top="1134" w:right="850" w:bottom="1134" w:left="850" w:header="720" w:footer="720" w:gutter="0"/>
           <w:cols w:space="720"/>
           <w:docGrid w:linePitch="360"/>
         </w:sectPr>
@@ -959,12 +959,12 @@
         <w:tblLook w:firstColumn="1" w:firstRow="1" w:lastColumn="0" w:lastRow="0" w:noHBand="0" w:noVBand="1" w:val="04A0"/>
       </w:tblPr>
       <w:tblGrid>
-        <w:gridCol w:w="9866"/>
+        <w:gridCol w:w="10206"/>
       </w:tblGrid>
       <w:tr>
         <w:tc>
           <w:tcPr>
-            <w:tcW w:type="dxa" w:w="9866"/>
+            <w:tcW w:type="dxa" w:w="10206"/>
             <w:shd w:val="clear" w:color="auto" w:fill="C8CFD8"/>
             <w:tcBorders>
               <w:top w:val="nil"/>
@@ -1002,7 +1002,7 @@
       <w:tr>
         <w:tc>
           <w:tcPr>
-            <w:tcW w:type="dxa" w:w="9866"/>
+            <w:tcW w:type="dxa" w:w="10206"/>
             <w:shd w:val="clear" w:color="auto" w:fill="C8CFD8"/>
             <w:tcBorders>
               <w:top w:val="nil"/>
@@ -1098,12 +1098,12 @@
         <w:tblLook w:firstColumn="1" w:firstRow="1" w:lastColumn="0" w:lastRow="0" w:noHBand="0" w:noVBand="1" w:val="04A0"/>
       </w:tblPr>
       <w:tblGrid>
-        <w:gridCol w:w="1020"/>
-        <w:gridCol w:w="1814"/>
+        <w:gridCol w:w="1134"/>
+        <w:gridCol w:w="1984"/>
+        <w:gridCol w:w="1871"/>
         <w:gridCol w:w="1701"/>
-        <w:gridCol w:w="1587"/>
-        <w:gridCol w:w="1701"/>
-        <w:gridCol w:w="1587"/>
+        <w:gridCol w:w="1871"/>
+        <w:gridCol w:w="1644"/>
       </w:tblGrid>
       <w:tr>
         <w:trPr>
@@ -1111,7 +1111,7 @@
         </w:trPr>
         <w:tc>
           <w:tcPr>
-            <w:tcW w:type="dxa" w:w="1020"/>
+            <w:tcW w:type="dxa" w:w="1134"/>
             <w:shd w:val="clear" w:color="auto" w:fill="0A2342"/>
             <w:tcBorders>
               <w:top w:val="nil"/>
@@ -1146,7 +1146,7 @@
         </w:tc>
         <w:tc>
           <w:tcPr>
-            <w:tcW w:type="dxa" w:w="1814"/>
+            <w:tcW w:type="dxa" w:w="1984"/>
             <w:shd w:val="clear" w:color="auto" w:fill="0A2342"/>
             <w:tcBorders>
               <w:top w:val="nil"/>
@@ -1181,7 +1181,7 @@
         </w:tc>
         <w:tc>
           <w:tcPr>
-            <w:tcW w:type="dxa" w:w="1701"/>
+            <w:tcW w:type="dxa" w:w="1871"/>
             <w:shd w:val="clear" w:color="auto" w:fill="0A2342"/>
             <w:tcBorders>
               <w:top w:val="nil"/>
@@ -1217,7 +1217,7 @@
         </w:tc>
         <w:tc>
           <w:tcPr>
-            <w:tcW w:type="dxa" w:w="1587"/>
+            <w:tcW w:type="dxa" w:w="1701"/>
             <w:shd w:val="clear" w:color="auto" w:fill="0A2342"/>
             <w:tcBorders>
               <w:top w:val="nil"/>
@@ -1253,7 +1253,7 @@
         </w:tc>
         <w:tc>
           <w:tcPr>
-            <w:tcW w:type="dxa" w:w="1701"/>
+            <w:tcW w:type="dxa" w:w="1871"/>
             <w:shd w:val="clear" w:color="auto" w:fill="0A2342"/>
             <w:tcBorders>
               <w:top w:val="nil"/>
@@ -1289,7 +1289,7 @@
         </w:tc>
         <w:tc>
           <w:tcPr>
-            <w:tcW w:type="dxa" w:w="1587"/>
+            <w:tcW w:type="dxa" w:w="1644"/>
             <w:shd w:val="clear" w:color="auto" w:fill="0A2342"/>
             <w:tcBorders>
               <w:top w:val="nil"/>
@@ -1327,7 +1327,7 @@
       <w:tr>
         <w:tc>
           <w:tcPr>
-            <w:tcW w:type="dxa" w:w="1020"/>
+            <w:tcW w:type="dxa" w:w="1134"/>
             <w:tcBorders>
               <w:bottom w:val="single" w:sz="4" w:color="D0D5DD"/>
             </w:tcBorders>
@@ -1352,7 +1352,7 @@
         </w:tc>
         <w:tc>
           <w:tcPr>
-            <w:tcW w:type="dxa" w:w="1814"/>
+            <w:tcW w:type="dxa" w:w="1984"/>
             <w:tcBorders>
               <w:bottom w:val="single" w:sz="4" w:color="D0D5DD"/>
             </w:tcBorders>
@@ -1377,7 +1377,7 @@
         </w:tc>
         <w:tc>
           <w:tcPr>
-            <w:tcW w:type="dxa" w:w="1701"/>
+            <w:tcW w:type="dxa" w:w="1871"/>
             <w:tcBorders>
               <w:bottom w:val="single" w:sz="4" w:color="D0D5DD"/>
             </w:tcBorders>
@@ -1403,7 +1403,7 @@
         </w:tc>
         <w:tc>
           <w:tcPr>
-            <w:tcW w:type="dxa" w:w="1587"/>
+            <w:tcW w:type="dxa" w:w="1701"/>
             <w:tcBorders>
               <w:bottom w:val="single" w:sz="4" w:color="D0D5DD"/>
             </w:tcBorders>
@@ -1429,7 +1429,7 @@
         </w:tc>
         <w:tc>
           <w:tcPr>
-            <w:tcW w:type="dxa" w:w="1701"/>
+            <w:tcW w:type="dxa" w:w="1871"/>
             <w:tcBorders>
               <w:bottom w:val="single" w:sz="4" w:color="D0D5DD"/>
             </w:tcBorders>
@@ -1455,7 +1455,7 @@
         </w:tc>
         <w:tc>
           <w:tcPr>
-            <w:tcW w:type="dxa" w:w="1587"/>
+            <w:tcW w:type="dxa" w:w="1644"/>
             <w:tcBorders>
               <w:bottom w:val="single" w:sz="4" w:color="D0D5DD"/>
             </w:tcBorders>
@@ -1483,7 +1483,7 @@
       <w:tr>
         <w:tc>
           <w:tcPr>
-            <w:tcW w:type="dxa" w:w="1020"/>
+            <w:tcW w:type="dxa" w:w="1134"/>
             <w:shd w:val="clear" w:color="auto" w:fill="F5F7FA"/>
             <w:tcBorders>
               <w:bottom w:val="single" w:sz="4" w:color="D0D5DD"/>
@@ -1509,7 +1509,7 @@
         </w:tc>
         <w:tc>
           <w:tcPr>
-            <w:tcW w:type="dxa" w:w="1814"/>
+            <w:tcW w:type="dxa" w:w="1984"/>
             <w:shd w:val="clear" w:color="auto" w:fill="F5F7FA"/>
             <w:tcBorders>
               <w:bottom w:val="single" w:sz="4" w:color="D0D5DD"/>
@@ -1535,7 +1535,7 @@
         </w:tc>
         <w:tc>
           <w:tcPr>
-            <w:tcW w:type="dxa" w:w="1701"/>
+            <w:tcW w:type="dxa" w:w="1871"/>
             <w:shd w:val="clear" w:color="auto" w:fill="F5F7FA"/>
             <w:tcBorders>
               <w:bottom w:val="single" w:sz="4" w:color="D0D5DD"/>
@@ -1562,7 +1562,7 @@
         </w:tc>
         <w:tc>
           <w:tcPr>
-            <w:tcW w:type="dxa" w:w="1587"/>
+            <w:tcW w:type="dxa" w:w="1701"/>
             <w:shd w:val="clear" w:color="auto" w:fill="F5F7FA"/>
             <w:tcBorders>
               <w:bottom w:val="single" w:sz="4" w:color="D0D5DD"/>
@@ -1589,7 +1589,7 @@
         </w:tc>
         <w:tc>
           <w:tcPr>
-            <w:tcW w:type="dxa" w:w="1701"/>
+            <w:tcW w:type="dxa" w:w="1871"/>
             <w:shd w:val="clear" w:color="auto" w:fill="F5F7FA"/>
             <w:tcBorders>
               <w:bottom w:val="single" w:sz="4" w:color="D0D5DD"/>
@@ -1616,7 +1616,7 @@
         </w:tc>
         <w:tc>
           <w:tcPr>
-            <w:tcW w:type="dxa" w:w="1587"/>
+            <w:tcW w:type="dxa" w:w="1644"/>
             <w:shd w:val="clear" w:color="auto" w:fill="F5F7FA"/>
             <w:tcBorders>
               <w:bottom w:val="single" w:sz="4" w:color="D0D5DD"/>
@@ -1645,7 +1645,7 @@
       <w:tr>
         <w:tc>
           <w:tcPr>
-            <w:tcW w:type="dxa" w:w="1020"/>
+            <w:tcW w:type="dxa" w:w="1134"/>
             <w:tcBorders>
               <w:bottom w:val="single" w:sz="4" w:color="D0D5DD"/>
             </w:tcBorders>
@@ -1670,7 +1670,7 @@
         </w:tc>
         <w:tc>
           <w:tcPr>
-            <w:tcW w:type="dxa" w:w="1814"/>
+            <w:tcW w:type="dxa" w:w="1984"/>
             <w:tcBorders>
               <w:bottom w:val="single" w:sz="4" w:color="D0D5DD"/>
             </w:tcBorders>
@@ -1695,7 +1695,7 @@
         </w:tc>
         <w:tc>
           <w:tcPr>
-            <w:tcW w:type="dxa" w:w="1701"/>
+            <w:tcW w:type="dxa" w:w="1871"/>
             <w:tcBorders>
               <w:bottom w:val="single" w:sz="4" w:color="D0D5DD"/>
             </w:tcBorders>
@@ -1721,7 +1721,7 @@
         </w:tc>
         <w:tc>
           <w:tcPr>
-            <w:tcW w:type="dxa" w:w="1587"/>
+            <w:tcW w:type="dxa" w:w="1701"/>
             <w:tcBorders>
               <w:bottom w:val="single" w:sz="4" w:color="D0D5DD"/>
             </w:tcBorders>
@@ -1747,7 +1747,7 @@
         </w:tc>
         <w:tc>
           <w:tcPr>
-            <w:tcW w:type="dxa" w:w="1701"/>
+            <w:tcW w:type="dxa" w:w="1871"/>
             <w:tcBorders>
               <w:bottom w:val="single" w:sz="4" w:color="D0D5DD"/>
             </w:tcBorders>
@@ -1773,7 +1773,7 @@
         </w:tc>
         <w:tc>
           <w:tcPr>
-            <w:tcW w:type="dxa" w:w="1587"/>
+            <w:tcW w:type="dxa" w:w="1644"/>
             <w:tcBorders>
               <w:bottom w:val="single" w:sz="4" w:color="D0D5DD"/>
             </w:tcBorders>
@@ -1801,7 +1801,7 @@
       <w:tr>
         <w:tc>
           <w:tcPr>
-            <w:tcW w:type="dxa" w:w="1020"/>
+            <w:tcW w:type="dxa" w:w="1134"/>
             <w:shd w:val="clear" w:color="auto" w:fill="F5F7FA"/>
             <w:tcBorders>
               <w:bottom w:val="single" w:sz="4" w:color="D0D5DD"/>
@@ -1827,7 +1827,7 @@
         </w:tc>
         <w:tc>
           <w:tcPr>
-            <w:tcW w:type="dxa" w:w="1814"/>
+            <w:tcW w:type="dxa" w:w="1984"/>
             <w:shd w:val="clear" w:color="auto" w:fill="F5F7FA"/>
             <w:tcBorders>
               <w:bottom w:val="single" w:sz="4" w:color="D0D5DD"/>
@@ -1853,7 +1853,7 @@
         </w:tc>
         <w:tc>
           <w:tcPr>
-            <w:tcW w:type="dxa" w:w="1701"/>
+            <w:tcW w:type="dxa" w:w="1871"/>
             <w:shd w:val="clear" w:color="auto" w:fill="F5F7FA"/>
             <w:tcBorders>
               <w:bottom w:val="single" w:sz="4" w:color="D0D5DD"/>
@@ -1880,7 +1880,7 @@
         </w:tc>
         <w:tc>
           <w:tcPr>
-            <w:tcW w:type="dxa" w:w="1587"/>
+            <w:tcW w:type="dxa" w:w="1701"/>
             <w:shd w:val="clear" w:color="auto" w:fill="F5F7FA"/>
             <w:tcBorders>
               <w:bottom w:val="single" w:sz="4" w:color="D0D5DD"/>
@@ -1907,7 +1907,7 @@
         </w:tc>
         <w:tc>
           <w:tcPr>
-            <w:tcW w:type="dxa" w:w="1701"/>
+            <w:tcW w:type="dxa" w:w="1871"/>
             <w:shd w:val="clear" w:color="auto" w:fill="F5F7FA"/>
             <w:tcBorders>
               <w:bottom w:val="single" w:sz="4" w:color="D0D5DD"/>
@@ -1934,7 +1934,7 @@
         </w:tc>
         <w:tc>
           <w:tcPr>
-            <w:tcW w:type="dxa" w:w="1587"/>
+            <w:tcW w:type="dxa" w:w="1644"/>
             <w:shd w:val="clear" w:color="auto" w:fill="F5F7FA"/>
             <w:tcBorders>
               <w:bottom w:val="single" w:sz="4" w:color="D0D5DD"/>
@@ -1963,7 +1963,7 @@
       <w:tr>
         <w:tc>
           <w:tcPr>
-            <w:tcW w:type="dxa" w:w="1020"/>
+            <w:tcW w:type="dxa" w:w="1134"/>
             <w:tcBorders>
               <w:bottom w:val="single" w:sz="4" w:color="D0D5DD"/>
             </w:tcBorders>
@@ -1988,7 +1988,7 @@
         </w:tc>
         <w:tc>
           <w:tcPr>
-            <w:tcW w:type="dxa" w:w="1814"/>
+            <w:tcW w:type="dxa" w:w="1984"/>
             <w:tcBorders>
               <w:bottom w:val="single" w:sz="4" w:color="D0D5DD"/>
             </w:tcBorders>
@@ -2013,7 +2013,7 @@
         </w:tc>
         <w:tc>
           <w:tcPr>
-            <w:tcW w:type="dxa" w:w="1701"/>
+            <w:tcW w:type="dxa" w:w="1871"/>
             <w:tcBorders>
               <w:bottom w:val="single" w:sz="4" w:color="D0D5DD"/>
             </w:tcBorders>
@@ -2039,7 +2039,7 @@
         </w:tc>
         <w:tc>
           <w:tcPr>
-            <w:tcW w:type="dxa" w:w="1587"/>
+            <w:tcW w:type="dxa" w:w="1701"/>
             <w:tcBorders>
               <w:bottom w:val="single" w:sz="4" w:color="D0D5DD"/>
             </w:tcBorders>
@@ -2065,7 +2065,7 @@
         </w:tc>
         <w:tc>
           <w:tcPr>
-            <w:tcW w:type="dxa" w:w="1701"/>
+            <w:tcW w:type="dxa" w:w="1871"/>
             <w:tcBorders>
               <w:bottom w:val="single" w:sz="4" w:color="D0D5DD"/>
             </w:tcBorders>
@@ -2091,7 +2091,7 @@
         </w:tc>
         <w:tc>
           <w:tcPr>
-            <w:tcW w:type="dxa" w:w="1587"/>
+            <w:tcW w:type="dxa" w:w="1644"/>
             <w:tcBorders>
               <w:bottom w:val="single" w:sz="4" w:color="D0D5DD"/>
             </w:tcBorders>
@@ -2119,7 +2119,7 @@
       <w:tr>
         <w:tc>
           <w:tcPr>
-            <w:tcW w:type="dxa" w:w="1020"/>
+            <w:tcW w:type="dxa" w:w="1134"/>
             <w:shd w:val="clear" w:color="auto" w:fill="F5F7FA"/>
             <w:tcBorders>
               <w:bottom w:val="single" w:sz="4" w:color="D0D5DD"/>
@@ -2145,7 +2145,7 @@
         </w:tc>
         <w:tc>
           <w:tcPr>
-            <w:tcW w:type="dxa" w:w="1814"/>
+            <w:tcW w:type="dxa" w:w="1984"/>
             <w:shd w:val="clear" w:color="auto" w:fill="F5F7FA"/>
             <w:tcBorders>
               <w:bottom w:val="single" w:sz="4" w:color="D0D5DD"/>
@@ -2171,7 +2171,7 @@
         </w:tc>
         <w:tc>
           <w:tcPr>
-            <w:tcW w:type="dxa" w:w="1701"/>
+            <w:tcW w:type="dxa" w:w="1871"/>
             <w:shd w:val="clear" w:color="auto" w:fill="F5F7FA"/>
             <w:tcBorders>
               <w:bottom w:val="single" w:sz="4" w:color="D0D5DD"/>
@@ -2198,7 +2198,7 @@
         </w:tc>
         <w:tc>
           <w:tcPr>
-            <w:tcW w:type="dxa" w:w="1587"/>
+            <w:tcW w:type="dxa" w:w="1701"/>
             <w:shd w:val="clear" w:color="auto" w:fill="F5F7FA"/>
             <w:tcBorders>
               <w:bottom w:val="single" w:sz="4" w:color="D0D5DD"/>
@@ -2225,7 +2225,7 @@
         </w:tc>
         <w:tc>
           <w:tcPr>
-            <w:tcW w:type="dxa" w:w="1701"/>
+            <w:tcW w:type="dxa" w:w="1871"/>
             <w:shd w:val="clear" w:color="auto" w:fill="F5F7FA"/>
             <w:tcBorders>
               <w:bottom w:val="single" w:sz="4" w:color="D0D5DD"/>
@@ -2252,7 +2252,7 @@
         </w:tc>
         <w:tc>
           <w:tcPr>
-            <w:tcW w:type="dxa" w:w="1587"/>
+            <w:tcW w:type="dxa" w:w="1644"/>
             <w:shd w:val="clear" w:color="auto" w:fill="F5F7FA"/>
             <w:tcBorders>
               <w:bottom w:val="single" w:sz="4" w:color="D0D5DD"/>
@@ -2281,7 +2281,7 @@
       <w:tr>
         <w:tc>
           <w:tcPr>
-            <w:tcW w:type="dxa" w:w="1020"/>
+            <w:tcW w:type="dxa" w:w="1134"/>
             <w:tcBorders>
               <w:bottom w:val="single" w:sz="4" w:color="D0D5DD"/>
             </w:tcBorders>
@@ -2306,7 +2306,7 @@
         </w:tc>
         <w:tc>
           <w:tcPr>
-            <w:tcW w:type="dxa" w:w="1814"/>
+            <w:tcW w:type="dxa" w:w="1984"/>
             <w:tcBorders>
               <w:bottom w:val="single" w:sz="4" w:color="D0D5DD"/>
             </w:tcBorders>
@@ -2331,7 +2331,7 @@
         </w:tc>
         <w:tc>
           <w:tcPr>
-            <w:tcW w:type="dxa" w:w="1701"/>
+            <w:tcW w:type="dxa" w:w="1871"/>
             <w:tcBorders>
               <w:bottom w:val="single" w:sz="4" w:color="D0D5DD"/>
             </w:tcBorders>
@@ -2357,7 +2357,7 @@
         </w:tc>
         <w:tc>
           <w:tcPr>
-            <w:tcW w:type="dxa" w:w="1587"/>
+            <w:tcW w:type="dxa" w:w="1701"/>
             <w:tcBorders>
               <w:bottom w:val="single" w:sz="4" w:color="D0D5DD"/>
             </w:tcBorders>
@@ -2383,7 +2383,7 @@
         </w:tc>
         <w:tc>
           <w:tcPr>
-            <w:tcW w:type="dxa" w:w="1701"/>
+            <w:tcW w:type="dxa" w:w="1871"/>
             <w:tcBorders>
               <w:bottom w:val="single" w:sz="4" w:color="D0D5DD"/>
             </w:tcBorders>
@@ -2409,7 +2409,7 @@
         </w:tc>
         <w:tc>
           <w:tcPr>
-            <w:tcW w:type="dxa" w:w="1587"/>
+            <w:tcW w:type="dxa" w:w="1644"/>
             <w:tcBorders>
               <w:bottom w:val="single" w:sz="4" w:color="D0D5DD"/>
             </w:tcBorders>
@@ -2437,7 +2437,7 @@
       <w:tr>
         <w:tc>
           <w:tcPr>
-            <w:tcW w:type="dxa" w:w="1020"/>
+            <w:tcW w:type="dxa" w:w="1134"/>
             <w:shd w:val="clear" w:color="auto" w:fill="F5F7FA"/>
             <w:tcBorders>
               <w:bottom w:val="single" w:sz="4" w:color="D0D5DD"/>
@@ -2463,7 +2463,7 @@
         </w:tc>
         <w:tc>
           <w:tcPr>
-            <w:tcW w:type="dxa" w:w="1814"/>
+            <w:tcW w:type="dxa" w:w="1984"/>
             <w:shd w:val="clear" w:color="auto" w:fill="F5F7FA"/>
             <w:tcBorders>
               <w:bottom w:val="single" w:sz="4" w:color="D0D5DD"/>
@@ -2489,7 +2489,7 @@
         </w:tc>
         <w:tc>
           <w:tcPr>
-            <w:tcW w:type="dxa" w:w="1701"/>
+            <w:tcW w:type="dxa" w:w="1871"/>
             <w:shd w:val="clear" w:color="auto" w:fill="F5F7FA"/>
             <w:tcBorders>
               <w:bottom w:val="single" w:sz="4" w:color="D0D5DD"/>
@@ -2516,7 +2516,7 @@
         </w:tc>
         <w:tc>
           <w:tcPr>
-            <w:tcW w:type="dxa" w:w="1587"/>
+            <w:tcW w:type="dxa" w:w="1701"/>
             <w:shd w:val="clear" w:color="auto" w:fill="F5F7FA"/>
             <w:tcBorders>
               <w:bottom w:val="single" w:sz="4" w:color="D0D5DD"/>
@@ -2543,7 +2543,7 @@
         </w:tc>
         <w:tc>
           <w:tcPr>
-            <w:tcW w:type="dxa" w:w="1701"/>
+            <w:tcW w:type="dxa" w:w="1871"/>
             <w:shd w:val="clear" w:color="auto" w:fill="F5F7FA"/>
             <w:tcBorders>
               <w:bottom w:val="single" w:sz="4" w:color="D0D5DD"/>
@@ -2570,7 +2570,7 @@
         </w:tc>
         <w:tc>
           <w:tcPr>
-            <w:tcW w:type="dxa" w:w="1587"/>
+            <w:tcW w:type="dxa" w:w="1644"/>
             <w:shd w:val="clear" w:color="auto" w:fill="F5F7FA"/>
             <w:tcBorders>
               <w:bottom w:val="single" w:sz="4" w:color="D0D5DD"/>
@@ -2599,7 +2599,7 @@
       <w:tr>
         <w:tc>
           <w:tcPr>
-            <w:tcW w:type="dxa" w:w="1020"/>
+            <w:tcW w:type="dxa" w:w="1134"/>
             <w:tcBorders>
               <w:bottom w:val="single" w:sz="4" w:color="D0D5DD"/>
             </w:tcBorders>
@@ -2624,7 +2624,7 @@
         </w:tc>
         <w:tc>
           <w:tcPr>
-            <w:tcW w:type="dxa" w:w="1814"/>
+            <w:tcW w:type="dxa" w:w="1984"/>
             <w:tcBorders>
               <w:bottom w:val="single" w:sz="4" w:color="D0D5DD"/>
             </w:tcBorders>
@@ -2649,7 +2649,7 @@
         </w:tc>
         <w:tc>
           <w:tcPr>
-            <w:tcW w:type="dxa" w:w="1701"/>
+            <w:tcW w:type="dxa" w:w="1871"/>
             <w:tcBorders>
               <w:bottom w:val="single" w:sz="4" w:color="D0D5DD"/>
             </w:tcBorders>
@@ -2675,7 +2675,7 @@
         </w:tc>
         <w:tc>
           <w:tcPr>
-            <w:tcW w:type="dxa" w:w="1587"/>
+            <w:tcW w:type="dxa" w:w="1701"/>
             <w:tcBorders>
               <w:bottom w:val="single" w:sz="4" w:color="D0D5DD"/>
             </w:tcBorders>
@@ -2701,7 +2701,7 @@
         </w:tc>
         <w:tc>
           <w:tcPr>
-            <w:tcW w:type="dxa" w:w="1701"/>
+            <w:tcW w:type="dxa" w:w="1871"/>
             <w:tcBorders>
               <w:bottom w:val="single" w:sz="4" w:color="D0D5DD"/>
             </w:tcBorders>
@@ -2727,7 +2727,7 @@
         </w:tc>
         <w:tc>
           <w:tcPr>
-            <w:tcW w:type="dxa" w:w="1587"/>
+            <w:tcW w:type="dxa" w:w="1644"/>
             <w:tcBorders>
               <w:bottom w:val="single" w:sz="4" w:color="D0D5DD"/>
             </w:tcBorders>
@@ -2755,7 +2755,7 @@
       <w:tr>
         <w:tc>
           <w:tcPr>
-            <w:tcW w:type="dxa" w:w="1020"/>
+            <w:tcW w:type="dxa" w:w="1134"/>
             <w:shd w:val="clear" w:color="auto" w:fill="F5F7FA"/>
             <w:tcBorders>
               <w:bottom w:val="single" w:sz="4" w:color="D0D5DD"/>
@@ -2781,7 +2781,7 @@
         </w:tc>
         <w:tc>
           <w:tcPr>
-            <w:tcW w:type="dxa" w:w="1814"/>
+            <w:tcW w:type="dxa" w:w="1984"/>
             <w:shd w:val="clear" w:color="auto" w:fill="F5F7FA"/>
             <w:tcBorders>
               <w:bottom w:val="single" w:sz="4" w:color="D0D5DD"/>
@@ -2807,7 +2807,7 @@
         </w:tc>
         <w:tc>
           <w:tcPr>
-            <w:tcW w:type="dxa" w:w="1701"/>
+            <w:tcW w:type="dxa" w:w="1871"/>
             <w:shd w:val="clear" w:color="auto" w:fill="F5F7FA"/>
             <w:tcBorders>
               <w:bottom w:val="single" w:sz="4" w:color="D0D5DD"/>
@@ -2834,7 +2834,7 @@
         </w:tc>
         <w:tc>
           <w:tcPr>
-            <w:tcW w:type="dxa" w:w="1587"/>
+            <w:tcW w:type="dxa" w:w="1701"/>
             <w:shd w:val="clear" w:color="auto" w:fill="F5F7FA"/>
             <w:tcBorders>
               <w:bottom w:val="single" w:sz="4" w:color="D0D5DD"/>
@@ -2861,7 +2861,7 @@
         </w:tc>
         <w:tc>
           <w:tcPr>
-            <w:tcW w:type="dxa" w:w="1701"/>
+            <w:tcW w:type="dxa" w:w="1871"/>
             <w:shd w:val="clear" w:color="auto" w:fill="F5F7FA"/>
             <w:tcBorders>
               <w:bottom w:val="single" w:sz="4" w:color="D0D5DD"/>
@@ -2888,7 +2888,7 @@
         </w:tc>
         <w:tc>
           <w:tcPr>
-            <w:tcW w:type="dxa" w:w="1587"/>
+            <w:tcW w:type="dxa" w:w="1644"/>
             <w:shd w:val="clear" w:color="auto" w:fill="F5F7FA"/>
             <w:tcBorders>
               <w:bottom w:val="single" w:sz="4" w:color="D0D5DD"/>
@@ -2917,7 +2917,7 @@
       <w:tr>
         <w:tc>
           <w:tcPr>
-            <w:tcW w:type="dxa" w:w="1020"/>
+            <w:tcW w:type="dxa" w:w="1134"/>
             <w:tcBorders>
               <w:bottom w:val="single" w:sz="4" w:color="D0D5DD"/>
             </w:tcBorders>
@@ -2942,7 +2942,7 @@
         </w:tc>
         <w:tc>
           <w:tcPr>
-            <w:tcW w:type="dxa" w:w="1814"/>
+            <w:tcW w:type="dxa" w:w="1984"/>
             <w:tcBorders>
               <w:bottom w:val="single" w:sz="4" w:color="D0D5DD"/>
             </w:tcBorders>
@@ -2967,7 +2967,7 @@
         </w:tc>
         <w:tc>
           <w:tcPr>
-            <w:tcW w:type="dxa" w:w="1701"/>
+            <w:tcW w:type="dxa" w:w="1871"/>
             <w:tcBorders>
               <w:bottom w:val="single" w:sz="4" w:color="D0D5DD"/>
             </w:tcBorders>
@@ -2993,7 +2993,7 @@
         </w:tc>
         <w:tc>
           <w:tcPr>
-            <w:tcW w:type="dxa" w:w="1587"/>
+            <w:tcW w:type="dxa" w:w="1701"/>
             <w:tcBorders>
               <w:bottom w:val="single" w:sz="4" w:color="D0D5DD"/>
             </w:tcBorders>
@@ -3019,7 +3019,7 @@
         </w:tc>
         <w:tc>
           <w:tcPr>
-            <w:tcW w:type="dxa" w:w="1701"/>
+            <w:tcW w:type="dxa" w:w="1871"/>
             <w:tcBorders>
               <w:bottom w:val="single" w:sz="4" w:color="D0D5DD"/>
             </w:tcBorders>
@@ -3045,7 +3045,7 @@
         </w:tc>
         <w:tc>
           <w:tcPr>
-            <w:tcW w:type="dxa" w:w="1587"/>
+            <w:tcW w:type="dxa" w:w="1644"/>
             <w:tcBorders>
               <w:bottom w:val="single" w:sz="4" w:color="D0D5DD"/>
             </w:tcBorders>
@@ -3073,7 +3073,7 @@
       <w:tr>
         <w:tc>
           <w:tcPr>
-            <w:tcW w:type="dxa" w:w="1020"/>
+            <w:tcW w:type="dxa" w:w="1134"/>
             <w:shd w:val="clear" w:color="auto" w:fill="F5F7FA"/>
             <w:tcBorders>
               <w:bottom w:val="single" w:sz="4" w:color="D0D5DD"/>
@@ -3099,7 +3099,7 @@
         </w:tc>
         <w:tc>
           <w:tcPr>
-            <w:tcW w:type="dxa" w:w="1814"/>
+            <w:tcW w:type="dxa" w:w="1984"/>
             <w:shd w:val="clear" w:color="auto" w:fill="F5F7FA"/>
             <w:tcBorders>
               <w:bottom w:val="single" w:sz="4" w:color="D0D5DD"/>
@@ -3125,7 +3125,7 @@
         </w:tc>
         <w:tc>
           <w:tcPr>
-            <w:tcW w:type="dxa" w:w="1701"/>
+            <w:tcW w:type="dxa" w:w="1871"/>
             <w:shd w:val="clear" w:color="auto" w:fill="F5F7FA"/>
             <w:tcBorders>
               <w:bottom w:val="single" w:sz="4" w:color="D0D5DD"/>
@@ -3152,7 +3152,7 @@
         </w:tc>
         <w:tc>
           <w:tcPr>
-            <w:tcW w:type="dxa" w:w="1587"/>
+            <w:tcW w:type="dxa" w:w="1701"/>
             <w:shd w:val="clear" w:color="auto" w:fill="F5F7FA"/>
             <w:tcBorders>
               <w:bottom w:val="single" w:sz="4" w:color="D0D5DD"/>
@@ -3179,7 +3179,7 @@
         </w:tc>
         <w:tc>
           <w:tcPr>
-            <w:tcW w:type="dxa" w:w="1701"/>
+            <w:tcW w:type="dxa" w:w="1871"/>
             <w:shd w:val="clear" w:color="auto" w:fill="F5F7FA"/>
             <w:tcBorders>
               <w:bottom w:val="single" w:sz="4" w:color="D0D5DD"/>
@@ -3206,7 +3206,7 @@
         </w:tc>
         <w:tc>
           <w:tcPr>
-            <w:tcW w:type="dxa" w:w="1587"/>
+            <w:tcW w:type="dxa" w:w="1644"/>
             <w:shd w:val="clear" w:color="auto" w:fill="F5F7FA"/>
             <w:tcBorders>
               <w:bottom w:val="single" w:sz="4" w:color="D0D5DD"/>
@@ -3235,7 +3235,7 @@
       <w:tr>
         <w:tc>
           <w:tcPr>
-            <w:tcW w:type="dxa" w:w="1020"/>
+            <w:tcW w:type="dxa" w:w="1134"/>
             <w:shd w:val="clear" w:color="auto" w:fill="E5EBF1"/>
             <w:tcBorders>
               <w:bottom w:val="single" w:sz="4" w:color="D0D5DD"/>
@@ -3261,7 +3261,7 @@
         </w:tc>
         <w:tc>
           <w:tcPr>
-            <w:tcW w:type="dxa" w:w="1814"/>
+            <w:tcW w:type="dxa" w:w="1984"/>
             <w:shd w:val="clear" w:color="auto" w:fill="E5EBF1"/>
             <w:tcBorders>
               <w:bottom w:val="single" w:sz="4" w:color="D0D5DD"/>
@@ -3286,7 +3286,7 @@
         </w:tc>
         <w:tc>
           <w:tcPr>
-            <w:tcW w:type="dxa" w:w="1701"/>
+            <w:tcW w:type="dxa" w:w="1871"/>
             <w:shd w:val="clear" w:color="auto" w:fill="E5EBF1"/>
             <w:tcBorders>
               <w:bottom w:val="single" w:sz="4" w:color="D0D5DD"/>
@@ -3312,7 +3312,7 @@
         </w:tc>
         <w:tc>
           <w:tcPr>
-            <w:tcW w:type="dxa" w:w="1587"/>
+            <w:tcW w:type="dxa" w:w="1701"/>
             <w:shd w:val="clear" w:color="auto" w:fill="E5EBF1"/>
             <w:tcBorders>
               <w:bottom w:val="single" w:sz="4" w:color="D0D5DD"/>
@@ -3339,7 +3339,7 @@
         </w:tc>
         <w:tc>
           <w:tcPr>
-            <w:tcW w:type="dxa" w:w="1701"/>
+            <w:tcW w:type="dxa" w:w="1871"/>
             <w:shd w:val="clear" w:color="auto" w:fill="E5EBF1"/>
             <w:tcBorders>
               <w:bottom w:val="single" w:sz="4" w:color="D0D5DD"/>
@@ -3365,7 +3365,7 @@
         </w:tc>
         <w:tc>
           <w:tcPr>
-            <w:tcW w:type="dxa" w:w="1587"/>
+            <w:tcW w:type="dxa" w:w="1644"/>
             <w:shd w:val="clear" w:color="auto" w:fill="E5EBF1"/>
             <w:tcBorders>
               <w:bottom w:val="single" w:sz="4" w:color="D0D5DD"/>
@@ -3432,12 +3432,12 @@
         <w:tblLook w:firstColumn="1" w:firstRow="1" w:lastColumn="0" w:lastRow="0" w:noHBand="0" w:noVBand="1" w:val="04A0"/>
       </w:tblPr>
       <w:tblGrid>
-        <w:gridCol w:w="907"/>
-        <w:gridCol w:w="1701"/>
-        <w:gridCol w:w="1814"/>
-        <w:gridCol w:w="1701"/>
-        <w:gridCol w:w="1814"/>
-        <w:gridCol w:w="1928"/>
+        <w:gridCol w:w="964"/>
+        <w:gridCol w:w="1757"/>
+        <w:gridCol w:w="1871"/>
+        <w:gridCol w:w="1757"/>
+        <w:gridCol w:w="1871"/>
+        <w:gridCol w:w="1984"/>
       </w:tblGrid>
       <w:tr>
         <w:trPr>
@@ -3445,7 +3445,7 @@
         </w:trPr>
         <w:tc>
           <w:tcPr>
-            <w:tcW w:type="dxa" w:w="907"/>
+            <w:tcW w:type="dxa" w:w="964"/>
             <w:shd w:val="clear" w:color="auto" w:fill="0A2342"/>
             <w:tcBorders>
               <w:top w:val="nil"/>
@@ -3480,7 +3480,7 @@
         </w:tc>
         <w:tc>
           <w:tcPr>
-            <w:tcW w:type="dxa" w:w="1701"/>
+            <w:tcW w:type="dxa" w:w="1757"/>
             <w:shd w:val="clear" w:color="auto" w:fill="0A2342"/>
             <w:tcBorders>
               <w:top w:val="nil"/>
@@ -3515,7 +3515,7 @@
         </w:tc>
         <w:tc>
           <w:tcPr>
-            <w:tcW w:type="dxa" w:w="1814"/>
+            <w:tcW w:type="dxa" w:w="1871"/>
             <w:shd w:val="clear" w:color="auto" w:fill="0A2342"/>
             <w:tcBorders>
               <w:top w:val="nil"/>
@@ -3551,7 +3551,7 @@
         </w:tc>
         <w:tc>
           <w:tcPr>
-            <w:tcW w:type="dxa" w:w="1701"/>
+            <w:tcW w:type="dxa" w:w="1757"/>
             <w:shd w:val="clear" w:color="auto" w:fill="0A2342"/>
             <w:tcBorders>
               <w:top w:val="nil"/>
@@ -3587,7 +3587,7 @@
         </w:tc>
         <w:tc>
           <w:tcPr>
-            <w:tcW w:type="dxa" w:w="1814"/>
+            <w:tcW w:type="dxa" w:w="1871"/>
             <w:shd w:val="clear" w:color="auto" w:fill="0A2342"/>
             <w:tcBorders>
               <w:top w:val="nil"/>
@@ -3623,7 +3623,7 @@
         </w:tc>
         <w:tc>
           <w:tcPr>
-            <w:tcW w:type="dxa" w:w="1928"/>
+            <w:tcW w:type="dxa" w:w="1984"/>
             <w:shd w:val="clear" w:color="auto" w:fill="0A2342"/>
             <w:tcBorders>
               <w:top w:val="nil"/>
@@ -3661,7 +3661,7 @@
       <w:tr>
         <w:tc>
           <w:tcPr>
-            <w:tcW w:type="dxa" w:w="907"/>
+            <w:tcW w:type="dxa" w:w="964"/>
             <w:tcBorders>
               <w:bottom w:val="single" w:sz="4" w:color="D0D5DD"/>
             </w:tcBorders>
@@ -3686,7 +3686,7 @@
         </w:tc>
         <w:tc>
           <w:tcPr>
-            <w:tcW w:type="dxa" w:w="1701"/>
+            <w:tcW w:type="dxa" w:w="1757"/>
             <w:tcBorders>
               <w:bottom w:val="single" w:sz="4" w:color="D0D5DD"/>
             </w:tcBorders>
@@ -3711,7 +3711,7 @@
         </w:tc>
         <w:tc>
           <w:tcPr>
-            <w:tcW w:type="dxa" w:w="1814"/>
+            <w:tcW w:type="dxa" w:w="1871"/>
             <w:tcBorders>
               <w:bottom w:val="single" w:sz="4" w:color="D0D5DD"/>
             </w:tcBorders>
@@ -3737,7 +3737,7 @@
         </w:tc>
         <w:tc>
           <w:tcPr>
-            <w:tcW w:type="dxa" w:w="1701"/>
+            <w:tcW w:type="dxa" w:w="1757"/>
             <w:tcBorders>
               <w:bottom w:val="single" w:sz="4" w:color="D0D5DD"/>
             </w:tcBorders>
@@ -3763,7 +3763,7 @@
         </w:tc>
         <w:tc>
           <w:tcPr>
-            <w:tcW w:type="dxa" w:w="1814"/>
+            <w:tcW w:type="dxa" w:w="1871"/>
             <w:tcBorders>
               <w:bottom w:val="single" w:sz="4" w:color="D0D5DD"/>
             </w:tcBorders>
@@ -3789,7 +3789,7 @@
         </w:tc>
         <w:tc>
           <w:tcPr>
-            <w:tcW w:type="dxa" w:w="1928"/>
+            <w:tcW w:type="dxa" w:w="1984"/>
             <w:tcBorders>
               <w:bottom w:val="single" w:sz="4" w:color="D0D5DD"/>
             </w:tcBorders>
@@ -3817,7 +3817,7 @@
       <w:tr>
         <w:tc>
           <w:tcPr>
-            <w:tcW w:type="dxa" w:w="907"/>
+            <w:tcW w:type="dxa" w:w="964"/>
             <w:shd w:val="clear" w:color="auto" w:fill="F5F7FA"/>
             <w:tcBorders>
               <w:bottom w:val="single" w:sz="4" w:color="D0D5DD"/>
@@ -3843,7 +3843,7 @@
         </w:tc>
         <w:tc>
           <w:tcPr>
-            <w:tcW w:type="dxa" w:w="1701"/>
+            <w:tcW w:type="dxa" w:w="1757"/>
             <w:shd w:val="clear" w:color="auto" w:fill="F5F7FA"/>
             <w:tcBorders>
               <w:bottom w:val="single" w:sz="4" w:color="D0D5DD"/>
@@ -3869,7 +3869,7 @@
         </w:tc>
         <w:tc>
           <w:tcPr>
-            <w:tcW w:type="dxa" w:w="1814"/>
+            <w:tcW w:type="dxa" w:w="1871"/>
             <w:shd w:val="clear" w:color="auto" w:fill="F5F7FA"/>
             <w:tcBorders>
               <w:bottom w:val="single" w:sz="4" w:color="D0D5DD"/>
@@ -3896,7 +3896,7 @@
         </w:tc>
         <w:tc>
           <w:tcPr>
-            <w:tcW w:type="dxa" w:w="1701"/>
+            <w:tcW w:type="dxa" w:w="1757"/>
             <w:shd w:val="clear" w:color="auto" w:fill="F5F7FA"/>
             <w:tcBorders>
               <w:bottom w:val="single" w:sz="4" w:color="D0D5DD"/>
@@ -3923,7 +3923,7 @@
         </w:tc>
         <w:tc>
           <w:tcPr>
-            <w:tcW w:type="dxa" w:w="1814"/>
+            <w:tcW w:type="dxa" w:w="1871"/>
             <w:shd w:val="clear" w:color="auto" w:fill="F5F7FA"/>
             <w:tcBorders>
               <w:bottom w:val="single" w:sz="4" w:color="D0D5DD"/>
@@ -3950,7 +3950,7 @@
         </w:tc>
         <w:tc>
           <w:tcPr>
-            <w:tcW w:type="dxa" w:w="1928"/>
+            <w:tcW w:type="dxa" w:w="1984"/>
             <w:shd w:val="clear" w:color="auto" w:fill="F5F7FA"/>
             <w:tcBorders>
               <w:bottom w:val="single" w:sz="4" w:color="D0D5DD"/>
@@ -3979,7 +3979,7 @@
       <w:tr>
         <w:tc>
           <w:tcPr>
-            <w:tcW w:type="dxa" w:w="907"/>
+            <w:tcW w:type="dxa" w:w="964"/>
             <w:tcBorders>
               <w:bottom w:val="single" w:sz="4" w:color="D0D5DD"/>
             </w:tcBorders>
@@ -4004,7 +4004,7 @@
         </w:tc>
         <w:tc>
           <w:tcPr>
-            <w:tcW w:type="dxa" w:w="1701"/>
+            <w:tcW w:type="dxa" w:w="1757"/>
             <w:tcBorders>
               <w:bottom w:val="single" w:sz="4" w:color="D0D5DD"/>
             </w:tcBorders>
@@ -4029,7 +4029,7 @@
         </w:tc>
         <w:tc>
           <w:tcPr>
-            <w:tcW w:type="dxa" w:w="1814"/>
+            <w:tcW w:type="dxa" w:w="1871"/>
             <w:tcBorders>
               <w:bottom w:val="single" w:sz="4" w:color="D0D5DD"/>
             </w:tcBorders>
@@ -4055,7 +4055,7 @@
         </w:tc>
         <w:tc>
           <w:tcPr>
-            <w:tcW w:type="dxa" w:w="1701"/>
+            <w:tcW w:type="dxa" w:w="1757"/>
             <w:tcBorders>
               <w:bottom w:val="single" w:sz="4" w:color="D0D5DD"/>
             </w:tcBorders>
@@ -4081,7 +4081,7 @@
         </w:tc>
         <w:tc>
           <w:tcPr>
-            <w:tcW w:type="dxa" w:w="1814"/>
+            <w:tcW w:type="dxa" w:w="1871"/>
             <w:tcBorders>
               <w:bottom w:val="single" w:sz="4" w:color="D0D5DD"/>
             </w:tcBorders>
@@ -4107,7 +4107,7 @@
         </w:tc>
         <w:tc>
           <w:tcPr>
-            <w:tcW w:type="dxa" w:w="1928"/>
+            <w:tcW w:type="dxa" w:w="1984"/>
             <w:tcBorders>
               <w:bottom w:val="single" w:sz="4" w:color="D0D5DD"/>
             </w:tcBorders>
@@ -4135,7 +4135,7 @@
       <w:tr>
         <w:tc>
           <w:tcPr>
-            <w:tcW w:type="dxa" w:w="907"/>
+            <w:tcW w:type="dxa" w:w="964"/>
             <w:shd w:val="clear" w:color="auto" w:fill="F5F7FA"/>
             <w:tcBorders>
               <w:bottom w:val="single" w:sz="4" w:color="D0D5DD"/>
@@ -4161,7 +4161,7 @@
         </w:tc>
         <w:tc>
           <w:tcPr>
-            <w:tcW w:type="dxa" w:w="1701"/>
+            <w:tcW w:type="dxa" w:w="1757"/>
             <w:shd w:val="clear" w:color="auto" w:fill="F5F7FA"/>
             <w:tcBorders>
               <w:bottom w:val="single" w:sz="4" w:color="D0D5DD"/>
@@ -4187,7 +4187,7 @@
         </w:tc>
         <w:tc>
           <w:tcPr>
-            <w:tcW w:type="dxa" w:w="1814"/>
+            <w:tcW w:type="dxa" w:w="1871"/>
             <w:shd w:val="clear" w:color="auto" w:fill="F5F7FA"/>
             <w:tcBorders>
               <w:bottom w:val="single" w:sz="4" w:color="D0D5DD"/>
@@ -4214,7 +4214,7 @@
         </w:tc>
         <w:tc>
           <w:tcPr>
-            <w:tcW w:type="dxa" w:w="1701"/>
+            <w:tcW w:type="dxa" w:w="1757"/>
             <w:shd w:val="clear" w:color="auto" w:fill="F5F7FA"/>
             <w:tcBorders>
               <w:bottom w:val="single" w:sz="4" w:color="D0D5DD"/>
@@ -4241,7 +4241,7 @@
         </w:tc>
         <w:tc>
           <w:tcPr>
-            <w:tcW w:type="dxa" w:w="1814"/>
+            <w:tcW w:type="dxa" w:w="1871"/>
             <w:shd w:val="clear" w:color="auto" w:fill="F5F7FA"/>
             <w:tcBorders>
               <w:bottom w:val="single" w:sz="4" w:color="D0D5DD"/>
@@ -4268,7 +4268,7 @@
         </w:tc>
         <w:tc>
           <w:tcPr>
-            <w:tcW w:type="dxa" w:w="1928"/>
+            <w:tcW w:type="dxa" w:w="1984"/>
             <w:shd w:val="clear" w:color="auto" w:fill="F5F7FA"/>
             <w:tcBorders>
               <w:bottom w:val="single" w:sz="4" w:color="D0D5DD"/>
@@ -4297,7 +4297,7 @@
       <w:tr>
         <w:tc>
           <w:tcPr>
-            <w:tcW w:type="dxa" w:w="907"/>
+            <w:tcW w:type="dxa" w:w="964"/>
             <w:tcBorders>
               <w:bottom w:val="single" w:sz="4" w:color="D0D5DD"/>
             </w:tcBorders>
@@ -4322,7 +4322,7 @@
         </w:tc>
         <w:tc>
           <w:tcPr>
-            <w:tcW w:type="dxa" w:w="1701"/>
+            <w:tcW w:type="dxa" w:w="1757"/>
             <w:tcBorders>
               <w:bottom w:val="single" w:sz="4" w:color="D0D5DD"/>
             </w:tcBorders>
@@ -4347,7 +4347,7 @@
         </w:tc>
         <w:tc>
           <w:tcPr>
-            <w:tcW w:type="dxa" w:w="1814"/>
+            <w:tcW w:type="dxa" w:w="1871"/>
             <w:tcBorders>
               <w:bottom w:val="single" w:sz="4" w:color="D0D5DD"/>
             </w:tcBorders>
@@ -4373,7 +4373,7 @@
         </w:tc>
         <w:tc>
           <w:tcPr>
-            <w:tcW w:type="dxa" w:w="1701"/>
+            <w:tcW w:type="dxa" w:w="1757"/>
             <w:tcBorders>
               <w:bottom w:val="single" w:sz="4" w:color="D0D5DD"/>
             </w:tcBorders>
@@ -4399,7 +4399,7 @@
         </w:tc>
         <w:tc>
           <w:tcPr>
-            <w:tcW w:type="dxa" w:w="1814"/>
+            <w:tcW w:type="dxa" w:w="1871"/>
             <w:tcBorders>
               <w:bottom w:val="single" w:sz="4" w:color="D0D5DD"/>
             </w:tcBorders>
@@ -4425,7 +4425,7 @@
         </w:tc>
         <w:tc>
           <w:tcPr>
-            <w:tcW w:type="dxa" w:w="1928"/>
+            <w:tcW w:type="dxa" w:w="1984"/>
             <w:tcBorders>
               <w:bottom w:val="single" w:sz="4" w:color="D0D5DD"/>
             </w:tcBorders>
@@ -4453,7 +4453,7 @@
       <w:tr>
         <w:tc>
           <w:tcPr>
-            <w:tcW w:type="dxa" w:w="907"/>
+            <w:tcW w:type="dxa" w:w="964"/>
             <w:shd w:val="clear" w:color="auto" w:fill="F5F7FA"/>
             <w:tcBorders>
               <w:bottom w:val="single" w:sz="4" w:color="D0D5DD"/>
@@ -4479,7 +4479,7 @@
         </w:tc>
         <w:tc>
           <w:tcPr>
-            <w:tcW w:type="dxa" w:w="1701"/>
+            <w:tcW w:type="dxa" w:w="1757"/>
             <w:shd w:val="clear" w:color="auto" w:fill="F5F7FA"/>
             <w:tcBorders>
               <w:bottom w:val="single" w:sz="4" w:color="D0D5DD"/>
@@ -4505,7 +4505,7 @@
         </w:tc>
         <w:tc>
           <w:tcPr>
-            <w:tcW w:type="dxa" w:w="1814"/>
+            <w:tcW w:type="dxa" w:w="1871"/>
             <w:shd w:val="clear" w:color="auto" w:fill="F5F7FA"/>
             <w:tcBorders>
               <w:bottom w:val="single" w:sz="4" w:color="D0D5DD"/>
@@ -4532,7 +4532,7 @@
         </w:tc>
         <w:tc>
           <w:tcPr>
-            <w:tcW w:type="dxa" w:w="1701"/>
+            <w:tcW w:type="dxa" w:w="1757"/>
             <w:shd w:val="clear" w:color="auto" w:fill="F5F7FA"/>
             <w:tcBorders>
               <w:bottom w:val="single" w:sz="4" w:color="D0D5DD"/>
@@ -4559,7 +4559,7 @@
         </w:tc>
         <w:tc>
           <w:tcPr>
-            <w:tcW w:type="dxa" w:w="1814"/>
+            <w:tcW w:type="dxa" w:w="1871"/>
             <w:shd w:val="clear" w:color="auto" w:fill="F5F7FA"/>
             <w:tcBorders>
               <w:bottom w:val="single" w:sz="4" w:color="D0D5DD"/>
@@ -4586,7 +4586,7 @@
         </w:tc>
         <w:tc>
           <w:tcPr>
-            <w:tcW w:type="dxa" w:w="1928"/>
+            <w:tcW w:type="dxa" w:w="1984"/>
             <w:shd w:val="clear" w:color="auto" w:fill="F5F7FA"/>
             <w:tcBorders>
               <w:bottom w:val="single" w:sz="4" w:color="D0D5DD"/>
@@ -4615,7 +4615,7 @@
       <w:tr>
         <w:tc>
           <w:tcPr>
-            <w:tcW w:type="dxa" w:w="907"/>
+            <w:tcW w:type="dxa" w:w="964"/>
             <w:tcBorders>
               <w:bottom w:val="single" w:sz="4" w:color="D0D5DD"/>
             </w:tcBorders>
@@ -4640,7 +4640,7 @@
         </w:tc>
         <w:tc>
           <w:tcPr>
-            <w:tcW w:type="dxa" w:w="1701"/>
+            <w:tcW w:type="dxa" w:w="1757"/>
             <w:tcBorders>
               <w:bottom w:val="single" w:sz="4" w:color="D0D5DD"/>
             </w:tcBorders>
@@ -4665,7 +4665,7 @@
         </w:tc>
         <w:tc>
           <w:tcPr>
-            <w:tcW w:type="dxa" w:w="1814"/>
+            <w:tcW w:type="dxa" w:w="1871"/>
             <w:tcBorders>
               <w:bottom w:val="single" w:sz="4" w:color="D0D5DD"/>
             </w:tcBorders>
@@ -4691,7 +4691,7 @@
         </w:tc>
         <w:tc>
           <w:tcPr>
-            <w:tcW w:type="dxa" w:w="1701"/>
+            <w:tcW w:type="dxa" w:w="1757"/>
             <w:tcBorders>
               <w:bottom w:val="single" w:sz="4" w:color="D0D5DD"/>
             </w:tcBorders>
@@ -4717,7 +4717,7 @@
         </w:tc>
         <w:tc>
           <w:tcPr>
-            <w:tcW w:type="dxa" w:w="1814"/>
+            <w:tcW w:type="dxa" w:w="1871"/>
             <w:tcBorders>
               <w:bottom w:val="single" w:sz="4" w:color="D0D5DD"/>
             </w:tcBorders>
@@ -4743,7 +4743,7 @@
         </w:tc>
         <w:tc>
           <w:tcPr>
-            <w:tcW w:type="dxa" w:w="1928"/>
+            <w:tcW w:type="dxa" w:w="1984"/>
             <w:tcBorders>
               <w:bottom w:val="single" w:sz="4" w:color="D0D5DD"/>
             </w:tcBorders>
@@ -4771,7 +4771,7 @@
       <w:tr>
         <w:tc>
           <w:tcPr>
-            <w:tcW w:type="dxa" w:w="907"/>
+            <w:tcW w:type="dxa" w:w="964"/>
             <w:shd w:val="clear" w:color="auto" w:fill="F5F7FA"/>
             <w:tcBorders>
               <w:bottom w:val="single" w:sz="4" w:color="D0D5DD"/>
@@ -4797,7 +4797,7 @@
         </w:tc>
         <w:tc>
           <w:tcPr>
-            <w:tcW w:type="dxa" w:w="1701"/>
+            <w:tcW w:type="dxa" w:w="1757"/>
             <w:shd w:val="clear" w:color="auto" w:fill="F5F7FA"/>
             <w:tcBorders>
               <w:bottom w:val="single" w:sz="4" w:color="D0D5DD"/>
@@ -4823,7 +4823,7 @@
         </w:tc>
         <w:tc>
           <w:tcPr>
-            <w:tcW w:type="dxa" w:w="1814"/>
+            <w:tcW w:type="dxa" w:w="1871"/>
             <w:shd w:val="clear" w:color="auto" w:fill="F5F7FA"/>
             <w:tcBorders>
               <w:bottom w:val="single" w:sz="4" w:color="D0D5DD"/>
@@ -4850,7 +4850,7 @@
         </w:tc>
         <w:tc>
           <w:tcPr>
-            <w:tcW w:type="dxa" w:w="1701"/>
+            <w:tcW w:type="dxa" w:w="1757"/>
             <w:shd w:val="clear" w:color="auto" w:fill="F5F7FA"/>
             <w:tcBorders>
               <w:bottom w:val="single" w:sz="4" w:color="D0D5DD"/>
@@ -4877,7 +4877,7 @@
         </w:tc>
         <w:tc>
           <w:tcPr>
-            <w:tcW w:type="dxa" w:w="1814"/>
+            <w:tcW w:type="dxa" w:w="1871"/>
             <w:shd w:val="clear" w:color="auto" w:fill="F5F7FA"/>
             <w:tcBorders>
               <w:bottom w:val="single" w:sz="4" w:color="D0D5DD"/>
@@ -4904,7 +4904,7 @@
         </w:tc>
         <w:tc>
           <w:tcPr>
-            <w:tcW w:type="dxa" w:w="1928"/>
+            <w:tcW w:type="dxa" w:w="1984"/>
             <w:shd w:val="clear" w:color="auto" w:fill="F5F7FA"/>
             <w:tcBorders>
               <w:bottom w:val="single" w:sz="4" w:color="D0D5DD"/>
@@ -4933,7 +4933,7 @@
       <w:tr>
         <w:tc>
           <w:tcPr>
-            <w:tcW w:type="dxa" w:w="907"/>
+            <w:tcW w:type="dxa" w:w="964"/>
             <w:tcBorders>
               <w:bottom w:val="single" w:sz="4" w:color="D0D5DD"/>
             </w:tcBorders>
@@ -4958,7 +4958,7 @@
         </w:tc>
         <w:tc>
           <w:tcPr>
-            <w:tcW w:type="dxa" w:w="1701"/>
+            <w:tcW w:type="dxa" w:w="1757"/>
             <w:tcBorders>
               <w:bottom w:val="single" w:sz="4" w:color="D0D5DD"/>
             </w:tcBorders>
@@ -4983,7 +4983,7 @@
         </w:tc>
         <w:tc>
           <w:tcPr>
-            <w:tcW w:type="dxa" w:w="1814"/>
+            <w:tcW w:type="dxa" w:w="1871"/>
             <w:tcBorders>
               <w:bottom w:val="single" w:sz="4" w:color="D0D5DD"/>
             </w:tcBorders>
@@ -5009,7 +5009,7 @@
         </w:tc>
         <w:tc>
           <w:tcPr>
-            <w:tcW w:type="dxa" w:w="1701"/>
+            <w:tcW w:type="dxa" w:w="1757"/>
             <w:tcBorders>
               <w:bottom w:val="single" w:sz="4" w:color="D0D5DD"/>
             </w:tcBorders>
@@ -5035,7 +5035,7 @@
         </w:tc>
         <w:tc>
           <w:tcPr>
-            <w:tcW w:type="dxa" w:w="1814"/>
+            <w:tcW w:type="dxa" w:w="1871"/>
             <w:tcBorders>
               <w:bottom w:val="single" w:sz="4" w:color="D0D5DD"/>
             </w:tcBorders>
@@ -5061,7 +5061,7 @@
         </w:tc>
         <w:tc>
           <w:tcPr>
-            <w:tcW w:type="dxa" w:w="1928"/>
+            <w:tcW w:type="dxa" w:w="1984"/>
             <w:tcBorders>
               <w:bottom w:val="single" w:sz="4" w:color="D0D5DD"/>
             </w:tcBorders>
@@ -5089,7 +5089,7 @@
       <w:tr>
         <w:tc>
           <w:tcPr>
-            <w:tcW w:type="dxa" w:w="907"/>
+            <w:tcW w:type="dxa" w:w="964"/>
             <w:shd w:val="clear" w:color="auto" w:fill="F5F7FA"/>
             <w:tcBorders>
               <w:bottom w:val="single" w:sz="4" w:color="D0D5DD"/>
@@ -5115,7 +5115,7 @@
         </w:tc>
         <w:tc>
           <w:tcPr>
-            <w:tcW w:type="dxa" w:w="1701"/>
+            <w:tcW w:type="dxa" w:w="1757"/>
             <w:shd w:val="clear" w:color="auto" w:fill="F5F7FA"/>
             <w:tcBorders>
               <w:bottom w:val="single" w:sz="4" w:color="D0D5DD"/>
@@ -5141,7 +5141,7 @@
         </w:tc>
         <w:tc>
           <w:tcPr>
-            <w:tcW w:type="dxa" w:w="1814"/>
+            <w:tcW w:type="dxa" w:w="1871"/>
             <w:shd w:val="clear" w:color="auto" w:fill="F5F7FA"/>
             <w:tcBorders>
               <w:bottom w:val="single" w:sz="4" w:color="D0D5DD"/>
@@ -5168,7 +5168,7 @@
         </w:tc>
         <w:tc>
           <w:tcPr>
-            <w:tcW w:type="dxa" w:w="1701"/>
+            <w:tcW w:type="dxa" w:w="1757"/>
             <w:shd w:val="clear" w:color="auto" w:fill="F5F7FA"/>
             <w:tcBorders>
               <w:bottom w:val="single" w:sz="4" w:color="D0D5DD"/>
@@ -5195,7 +5195,7 @@
         </w:tc>
         <w:tc>
           <w:tcPr>
-            <w:tcW w:type="dxa" w:w="1814"/>
+            <w:tcW w:type="dxa" w:w="1871"/>
             <w:shd w:val="clear" w:color="auto" w:fill="F5F7FA"/>
             <w:tcBorders>
               <w:bottom w:val="single" w:sz="4" w:color="D0D5DD"/>
@@ -5222,7 +5222,7 @@
         </w:tc>
         <w:tc>
           <w:tcPr>
-            <w:tcW w:type="dxa" w:w="1928"/>
+            <w:tcW w:type="dxa" w:w="1984"/>
             <w:shd w:val="clear" w:color="auto" w:fill="F5F7FA"/>
             <w:tcBorders>
               <w:bottom w:val="single" w:sz="4" w:color="D0D5DD"/>
@@ -5251,7 +5251,7 @@
       <w:tr>
         <w:tc>
           <w:tcPr>
-            <w:tcW w:type="dxa" w:w="907"/>
+            <w:tcW w:type="dxa" w:w="964"/>
             <w:tcBorders>
               <w:bottom w:val="single" w:sz="4" w:color="D0D5DD"/>
             </w:tcBorders>
@@ -5276,7 +5276,7 @@
         </w:tc>
         <w:tc>
           <w:tcPr>
-            <w:tcW w:type="dxa" w:w="1701"/>
+            <w:tcW w:type="dxa" w:w="1757"/>
             <w:tcBorders>
               <w:bottom w:val="single" w:sz="4" w:color="D0D5DD"/>
             </w:tcBorders>
@@ -5301,7 +5301,7 @@
         </w:tc>
         <w:tc>
           <w:tcPr>
-            <w:tcW w:type="dxa" w:w="1814"/>
+            <w:tcW w:type="dxa" w:w="1871"/>
             <w:tcBorders>
               <w:bottom w:val="single" w:sz="4" w:color="D0D5DD"/>
             </w:tcBorders>
@@ -5327,7 +5327,7 @@
         </w:tc>
         <w:tc>
           <w:tcPr>
-            <w:tcW w:type="dxa" w:w="1701"/>
+            <w:tcW w:type="dxa" w:w="1757"/>
             <w:tcBorders>
               <w:bottom w:val="single" w:sz="4" w:color="D0D5DD"/>
             </w:tcBorders>
@@ -5353,7 +5353,7 @@
         </w:tc>
         <w:tc>
           <w:tcPr>
-            <w:tcW w:type="dxa" w:w="1814"/>
+            <w:tcW w:type="dxa" w:w="1871"/>
             <w:tcBorders>
               <w:bottom w:val="single" w:sz="4" w:color="D0D5DD"/>
             </w:tcBorders>
@@ -5379,7 +5379,7 @@
         </w:tc>
         <w:tc>
           <w:tcPr>
-            <w:tcW w:type="dxa" w:w="1928"/>
+            <w:tcW w:type="dxa" w:w="1984"/>
             <w:tcBorders>
               <w:bottom w:val="single" w:sz="4" w:color="D0D5DD"/>
             </w:tcBorders>
@@ -5407,7 +5407,7 @@
       <w:tr>
         <w:tc>
           <w:tcPr>
-            <w:tcW w:type="dxa" w:w="907"/>
+            <w:tcW w:type="dxa" w:w="964"/>
             <w:shd w:val="clear" w:color="auto" w:fill="F5F7FA"/>
             <w:tcBorders>
               <w:bottom w:val="single" w:sz="4" w:color="D0D5DD"/>
@@ -5433,7 +5433,7 @@
         </w:tc>
         <w:tc>
           <w:tcPr>
-            <w:tcW w:type="dxa" w:w="1701"/>
+            <w:tcW w:type="dxa" w:w="1757"/>
             <w:shd w:val="clear" w:color="auto" w:fill="F5F7FA"/>
             <w:tcBorders>
               <w:bottom w:val="single" w:sz="4" w:color="D0D5DD"/>
@@ -5459,7 +5459,7 @@
         </w:tc>
         <w:tc>
           <w:tcPr>
-            <w:tcW w:type="dxa" w:w="1814"/>
+            <w:tcW w:type="dxa" w:w="1871"/>
             <w:shd w:val="clear" w:color="auto" w:fill="F5F7FA"/>
             <w:tcBorders>
               <w:bottom w:val="single" w:sz="4" w:color="D0D5DD"/>
@@ -5486,7 +5486,7 @@
         </w:tc>
         <w:tc>
           <w:tcPr>
-            <w:tcW w:type="dxa" w:w="1701"/>
+            <w:tcW w:type="dxa" w:w="1757"/>
             <w:shd w:val="clear" w:color="auto" w:fill="F5F7FA"/>
             <w:tcBorders>
               <w:bottom w:val="single" w:sz="4" w:color="D0D5DD"/>
@@ -5513,7 +5513,7 @@
         </w:tc>
         <w:tc>
           <w:tcPr>
-            <w:tcW w:type="dxa" w:w="1814"/>
+            <w:tcW w:type="dxa" w:w="1871"/>
             <w:shd w:val="clear" w:color="auto" w:fill="F5F7FA"/>
             <w:tcBorders>
               <w:bottom w:val="single" w:sz="4" w:color="D0D5DD"/>
@@ -5540,7 +5540,7 @@
         </w:tc>
         <w:tc>
           <w:tcPr>
-            <w:tcW w:type="dxa" w:w="1928"/>
+            <w:tcW w:type="dxa" w:w="1984"/>
             <w:shd w:val="clear" w:color="auto" w:fill="F5F7FA"/>
             <w:tcBorders>
               <w:bottom w:val="single" w:sz="4" w:color="D0D5DD"/>
@@ -5569,7 +5569,7 @@
       <w:tr>
         <w:tc>
           <w:tcPr>
-            <w:tcW w:type="dxa" w:w="907"/>
+            <w:tcW w:type="dxa" w:w="964"/>
             <w:shd w:val="clear" w:color="auto" w:fill="E5EBF1"/>
             <w:tcBorders>
               <w:bottom w:val="single" w:sz="4" w:color="D0D5DD"/>
@@ -5595,7 +5595,7 @@
         </w:tc>
         <w:tc>
           <w:tcPr>
-            <w:tcW w:type="dxa" w:w="1701"/>
+            <w:tcW w:type="dxa" w:w="1757"/>
             <w:shd w:val="clear" w:color="auto" w:fill="E5EBF1"/>
             <w:tcBorders>
               <w:bottom w:val="single" w:sz="4" w:color="D0D5DD"/>
@@ -5620,7 +5620,7 @@
         </w:tc>
         <w:tc>
           <w:tcPr>
-            <w:tcW w:type="dxa" w:w="1814"/>
+            <w:tcW w:type="dxa" w:w="1871"/>
             <w:shd w:val="clear" w:color="auto" w:fill="E5EBF1"/>
             <w:tcBorders>
               <w:bottom w:val="single" w:sz="4" w:color="D0D5DD"/>
@@ -5646,7 +5646,7 @@
         </w:tc>
         <w:tc>
           <w:tcPr>
-            <w:tcW w:type="dxa" w:w="1701"/>
+            <w:tcW w:type="dxa" w:w="1757"/>
             <w:shd w:val="clear" w:color="auto" w:fill="E5EBF1"/>
             <w:tcBorders>
               <w:bottom w:val="single" w:sz="4" w:color="D0D5DD"/>
@@ -5673,7 +5673,7 @@
         </w:tc>
         <w:tc>
           <w:tcPr>
-            <w:tcW w:type="dxa" w:w="1814"/>
+            <w:tcW w:type="dxa" w:w="1871"/>
             <w:shd w:val="clear" w:color="auto" w:fill="E5EBF1"/>
             <w:tcBorders>
               <w:bottom w:val="single" w:sz="4" w:color="D0D5DD"/>
@@ -5699,7 +5699,7 @@
         </w:tc>
         <w:tc>
           <w:tcPr>
-            <w:tcW w:type="dxa" w:w="1928"/>
+            <w:tcW w:type="dxa" w:w="1984"/>
             <w:shd w:val="clear" w:color="auto" w:fill="E5EBF1"/>
             <w:tcBorders>
               <w:bottom w:val="single" w:sz="4" w:color="D0D5DD"/>
@@ -5750,9 +5750,9 @@
         <w:tblLook w:firstColumn="1" w:firstRow="1" w:lastColumn="0" w:lastRow="0" w:noHBand="0" w:noVBand="1" w:val="04A0"/>
       </w:tblPr>
       <w:tblGrid>
-        <w:gridCol w:w="5669"/>
-        <w:gridCol w:w="2268"/>
-        <w:gridCol w:w="1928"/>
+        <w:gridCol w:w="5839"/>
+        <w:gridCol w:w="2324"/>
+        <w:gridCol w:w="2041"/>
       </w:tblGrid>
       <w:tr>
         <w:trPr>
@@ -5760,7 +5760,7 @@
         </w:trPr>
         <w:tc>
           <w:tcPr>
-            <w:tcW w:type="dxa" w:w="5669"/>
+            <w:tcW w:type="dxa" w:w="5839"/>
             <w:shd w:val="clear" w:color="auto" w:fill="0A2342"/>
             <w:tcBorders>
               <w:top w:val="nil"/>
@@ -5795,7 +5795,7 @@
         </w:tc>
         <w:tc>
           <w:tcPr>
-            <w:tcW w:type="dxa" w:w="2268"/>
+            <w:tcW w:type="dxa" w:w="2324"/>
             <w:shd w:val="clear" w:color="auto" w:fill="0A2342"/>
             <w:tcBorders>
               <w:top w:val="nil"/>
@@ -5830,7 +5830,7 @@
         </w:tc>
         <w:tc>
           <w:tcPr>
-            <w:tcW w:type="dxa" w:w="1928"/>
+            <w:tcW w:type="dxa" w:w="2041"/>
             <w:shd w:val="clear" w:color="auto" w:fill="0A2342"/>
             <w:tcBorders>
               <w:top w:val="nil"/>
@@ -5868,7 +5868,7 @@
       <w:tr>
         <w:tc>
           <w:tcPr>
-            <w:tcW w:type="dxa" w:w="5669"/>
+            <w:tcW w:type="dxa" w:w="5839"/>
             <w:tcBorders>
               <w:bottom w:val="single" w:sz="4" w:color="D0D5DD"/>
             </w:tcBorders>
@@ -5893,7 +5893,7 @@
         </w:tc>
         <w:tc>
           <w:tcPr>
-            <w:tcW w:type="dxa" w:w="2268"/>
+            <w:tcW w:type="dxa" w:w="2324"/>
             <w:tcBorders>
               <w:bottom w:val="single" w:sz="4" w:color="D0D5DD"/>
             </w:tcBorders>
@@ -5918,7 +5918,7 @@
         </w:tc>
         <w:tc>
           <w:tcPr>
-            <w:tcW w:type="dxa" w:w="1928"/>
+            <w:tcW w:type="dxa" w:w="2041"/>
             <w:tcBorders>
               <w:bottom w:val="single" w:sz="4" w:color="D0D5DD"/>
             </w:tcBorders>
@@ -5946,7 +5946,7 @@
       <w:tr>
         <w:tc>
           <w:tcPr>
-            <w:tcW w:type="dxa" w:w="5669"/>
+            <w:tcW w:type="dxa" w:w="5839"/>
             <w:shd w:val="clear" w:color="auto" w:fill="F5F7FA"/>
             <w:tcBorders>
               <w:bottom w:val="single" w:sz="4" w:color="D0D5DD"/>
@@ -5972,7 +5972,7 @@
         </w:tc>
         <w:tc>
           <w:tcPr>
-            <w:tcW w:type="dxa" w:w="2268"/>
+            <w:tcW w:type="dxa" w:w="2324"/>
             <w:shd w:val="clear" w:color="auto" w:fill="F5F7FA"/>
             <w:tcBorders>
               <w:bottom w:val="single" w:sz="4" w:color="D0D5DD"/>
@@ -5998,7 +5998,7 @@
         </w:tc>
         <w:tc>
           <w:tcPr>
-            <w:tcW w:type="dxa" w:w="1928"/>
+            <w:tcW w:type="dxa" w:w="2041"/>
             <w:shd w:val="clear" w:color="auto" w:fill="F5F7FA"/>
             <w:tcBorders>
               <w:bottom w:val="single" w:sz="4" w:color="D0D5DD"/>
@@ -6027,7 +6027,7 @@
       <w:tr>
         <w:tc>
           <w:tcPr>
-            <w:tcW w:type="dxa" w:w="5669"/>
+            <w:tcW w:type="dxa" w:w="5839"/>
             <w:tcBorders>
               <w:bottom w:val="single" w:sz="4" w:color="D0D5DD"/>
             </w:tcBorders>
@@ -6052,7 +6052,7 @@
         </w:tc>
         <w:tc>
           <w:tcPr>
-            <w:tcW w:type="dxa" w:w="2268"/>
+            <w:tcW w:type="dxa" w:w="2324"/>
             <w:tcBorders>
               <w:bottom w:val="single" w:sz="4" w:color="D0D5DD"/>
             </w:tcBorders>
@@ -6077,7 +6077,7 @@
         </w:tc>
         <w:tc>
           <w:tcPr>
-            <w:tcW w:type="dxa" w:w="1928"/>
+            <w:tcW w:type="dxa" w:w="2041"/>
             <w:tcBorders>
               <w:bottom w:val="single" w:sz="4" w:color="D0D5DD"/>
             </w:tcBorders>
@@ -6105,7 +6105,7 @@
       <w:tr>
         <w:tc>
           <w:tcPr>
-            <w:tcW w:type="dxa" w:w="5669"/>
+            <w:tcW w:type="dxa" w:w="5839"/>
             <w:shd w:val="clear" w:color="auto" w:fill="F5F7FA"/>
             <w:tcBorders>
               <w:bottom w:val="single" w:sz="4" w:color="D0D5DD"/>
@@ -6131,7 +6131,7 @@
         </w:tc>
         <w:tc>
           <w:tcPr>
-            <w:tcW w:type="dxa" w:w="2268"/>
+            <w:tcW w:type="dxa" w:w="2324"/>
             <w:shd w:val="clear" w:color="auto" w:fill="F5F7FA"/>
             <w:tcBorders>
               <w:bottom w:val="single" w:sz="4" w:color="D0D5DD"/>
@@ -6157,7 +6157,7 @@
         </w:tc>
         <w:tc>
           <w:tcPr>
-            <w:tcW w:type="dxa" w:w="1928"/>
+            <w:tcW w:type="dxa" w:w="2041"/>
             <w:shd w:val="clear" w:color="auto" w:fill="F5F7FA"/>
             <w:tcBorders>
               <w:bottom w:val="single" w:sz="4" w:color="D0D5DD"/>
@@ -6186,7 +6186,7 @@
       <w:tr>
         <w:tc>
           <w:tcPr>
-            <w:tcW w:type="dxa" w:w="5669"/>
+            <w:tcW w:type="dxa" w:w="5839"/>
             <w:tcBorders>
               <w:bottom w:val="single" w:sz="4" w:color="D0D5DD"/>
             </w:tcBorders>
@@ -6211,7 +6211,7 @@
         </w:tc>
         <w:tc>
           <w:tcPr>
-            <w:tcW w:type="dxa" w:w="2268"/>
+            <w:tcW w:type="dxa" w:w="2324"/>
             <w:tcBorders>
               <w:bottom w:val="single" w:sz="4" w:color="D0D5DD"/>
             </w:tcBorders>
@@ -6236,7 +6236,7 @@
         </w:tc>
         <w:tc>
           <w:tcPr>
-            <w:tcW w:type="dxa" w:w="1928"/>
+            <w:tcW w:type="dxa" w:w="2041"/>
             <w:tcBorders>
               <w:bottom w:val="single" w:sz="4" w:color="D0D5DD"/>
             </w:tcBorders>
@@ -6264,7 +6264,7 @@
       <w:tr>
         <w:tc>
           <w:tcPr>
-            <w:tcW w:type="dxa" w:w="5669"/>
+            <w:tcW w:type="dxa" w:w="5839"/>
             <w:shd w:val="clear" w:color="auto" w:fill="F5F7FA"/>
             <w:tcBorders>
               <w:bottom w:val="single" w:sz="4" w:color="D0D5DD"/>
@@ -6290,7 +6290,7 @@
         </w:tc>
         <w:tc>
           <w:tcPr>
-            <w:tcW w:type="dxa" w:w="2268"/>
+            <w:tcW w:type="dxa" w:w="2324"/>
             <w:shd w:val="clear" w:color="auto" w:fill="F5F7FA"/>
             <w:tcBorders>
               <w:bottom w:val="single" w:sz="4" w:color="D0D5DD"/>
@@ -6316,7 +6316,7 @@
         </w:tc>
         <w:tc>
           <w:tcPr>
-            <w:tcW w:type="dxa" w:w="1928"/>
+            <w:tcW w:type="dxa" w:w="2041"/>
             <w:shd w:val="clear" w:color="auto" w:fill="F5F7FA"/>
             <w:tcBorders>
               <w:bottom w:val="single" w:sz="4" w:color="D0D5DD"/>
@@ -6345,7 +6345,7 @@
       <w:tr>
         <w:tc>
           <w:tcPr>
-            <w:tcW w:type="dxa" w:w="5669"/>
+            <w:tcW w:type="dxa" w:w="5839"/>
             <w:shd w:val="clear" w:color="auto" w:fill="E5EBF1"/>
             <w:tcBorders>
               <w:bottom w:val="single" w:sz="4" w:color="D0D5DD"/>
@@ -6371,7 +6371,7 @@
         </w:tc>
         <w:tc>
           <w:tcPr>
-            <w:tcW w:type="dxa" w:w="2268"/>
+            <w:tcW w:type="dxa" w:w="2324"/>
             <w:shd w:val="clear" w:color="auto" w:fill="E5EBF1"/>
             <w:tcBorders>
               <w:bottom w:val="single" w:sz="4" w:color="D0D5DD"/>
@@ -6396,7 +6396,7 @@
         </w:tc>
         <w:tc>
           <w:tcPr>
-            <w:tcW w:type="dxa" w:w="1928"/>
+            <w:tcW w:type="dxa" w:w="2041"/>
             <w:shd w:val="clear" w:color="auto" w:fill="E5EBF1"/>
             <w:tcBorders>
               <w:bottom w:val="single" w:sz="4" w:color="D0D5DD"/>
@@ -6464,12 +6464,12 @@
       </w:tblPr>
       <w:tblGrid>
         <w:gridCol w:w="794"/>
-        <w:gridCol w:w="1020"/>
-        <w:gridCol w:w="1814"/>
-        <w:gridCol w:w="1247"/>
-        <w:gridCol w:w="1247"/>
-        <w:gridCol w:w="1134"/>
-        <w:gridCol w:w="1247"/>
+        <w:gridCol w:w="1077"/>
+        <w:gridCol w:w="1871"/>
+        <w:gridCol w:w="1304"/>
+        <w:gridCol w:w="1304"/>
+        <w:gridCol w:w="1191"/>
+        <w:gridCol w:w="1304"/>
         <w:gridCol w:w="1361"/>
       </w:tblGrid>
       <w:tr>
@@ -6513,7 +6513,7 @@
         </w:tc>
         <w:tc>
           <w:tcPr>
-            <w:tcW w:type="dxa" w:w="1020"/>
+            <w:tcW w:type="dxa" w:w="1077"/>
             <w:shd w:val="clear" w:color="auto" w:fill="0A2342"/>
             <w:tcBorders>
               <w:top w:val="nil"/>
@@ -6548,7 +6548,7 @@
         </w:tc>
         <w:tc>
           <w:tcPr>
-            <w:tcW w:type="dxa" w:w="1814"/>
+            <w:tcW w:type="dxa" w:w="1871"/>
             <w:shd w:val="clear" w:color="auto" w:fill="0A2342"/>
             <w:tcBorders>
               <w:top w:val="nil"/>
@@ -6583,7 +6583,7 @@
         </w:tc>
         <w:tc>
           <w:tcPr>
-            <w:tcW w:type="dxa" w:w="1247"/>
+            <w:tcW w:type="dxa" w:w="1304"/>
             <w:shd w:val="clear" w:color="auto" w:fill="0A2342"/>
             <w:tcBorders>
               <w:top w:val="nil"/>
@@ -6619,7 +6619,7 @@
         </w:tc>
         <w:tc>
           <w:tcPr>
-            <w:tcW w:type="dxa" w:w="1247"/>
+            <w:tcW w:type="dxa" w:w="1304"/>
             <w:shd w:val="clear" w:color="auto" w:fill="0A2342"/>
             <w:tcBorders>
               <w:top w:val="nil"/>
@@ -6655,7 +6655,7 @@
         </w:tc>
         <w:tc>
           <w:tcPr>
-            <w:tcW w:type="dxa" w:w="1134"/>
+            <w:tcW w:type="dxa" w:w="1191"/>
             <w:shd w:val="clear" w:color="auto" w:fill="0A2342"/>
             <w:tcBorders>
               <w:top w:val="nil"/>
@@ -6691,7 +6691,7 @@
         </w:tc>
         <w:tc>
           <w:tcPr>
-            <w:tcW w:type="dxa" w:w="1247"/>
+            <w:tcW w:type="dxa" w:w="1304"/>
             <w:shd w:val="clear" w:color="auto" w:fill="0A2342"/>
             <w:tcBorders>
               <w:top w:val="nil"/>
@@ -6790,7 +6790,7 @@
         </w:tc>
         <w:tc>
           <w:tcPr>
-            <w:tcW w:type="dxa" w:w="1020"/>
+            <w:tcW w:type="dxa" w:w="1077"/>
             <w:tcBorders>
               <w:bottom w:val="single" w:sz="4" w:color="D0D5DD"/>
             </w:tcBorders>
@@ -6815,7 +6815,7 @@
         </w:tc>
         <w:tc>
           <w:tcPr>
-            <w:tcW w:type="dxa" w:w="1814"/>
+            <w:tcW w:type="dxa" w:w="1871"/>
             <w:tcBorders>
               <w:bottom w:val="single" w:sz="4" w:color="D0D5DD"/>
             </w:tcBorders>
@@ -6840,7 +6840,7 @@
         </w:tc>
         <w:tc>
           <w:tcPr>
-            <w:tcW w:type="dxa" w:w="1247"/>
+            <w:tcW w:type="dxa" w:w="1304"/>
             <w:tcBorders>
               <w:bottom w:val="single" w:sz="4" w:color="D0D5DD"/>
             </w:tcBorders>
@@ -6866,7 +6866,7 @@
         </w:tc>
         <w:tc>
           <w:tcPr>
-            <w:tcW w:type="dxa" w:w="1247"/>
+            <w:tcW w:type="dxa" w:w="1304"/>
             <w:tcBorders>
               <w:bottom w:val="single" w:sz="4" w:color="D0D5DD"/>
             </w:tcBorders>
@@ -6892,7 +6892,7 @@
         </w:tc>
         <w:tc>
           <w:tcPr>
-            <w:tcW w:type="dxa" w:w="1134"/>
+            <w:tcW w:type="dxa" w:w="1191"/>
             <w:tcBorders>
               <w:bottom w:val="single" w:sz="4" w:color="D0D5DD"/>
             </w:tcBorders>
@@ -6918,7 +6918,7 @@
         </w:tc>
         <w:tc>
           <w:tcPr>
-            <w:tcW w:type="dxa" w:w="1247"/>
+            <w:tcW w:type="dxa" w:w="1304"/>
             <w:tcBorders>
               <w:bottom w:val="single" w:sz="4" w:color="D0D5DD"/>
             </w:tcBorders>
@@ -6998,7 +6998,7 @@
         </w:tc>
         <w:tc>
           <w:tcPr>
-            <w:tcW w:type="dxa" w:w="1020"/>
+            <w:tcW w:type="dxa" w:w="1077"/>
             <w:shd w:val="clear" w:color="auto" w:fill="E5EBF1"/>
             <w:tcBorders>
               <w:bottom w:val="single" w:sz="4" w:color="D0D5DD"/>
@@ -7023,7 +7023,7 @@
         </w:tc>
         <w:tc>
           <w:tcPr>
-            <w:tcW w:type="dxa" w:w="1814"/>
+            <w:tcW w:type="dxa" w:w="1871"/>
             <w:shd w:val="clear" w:color="auto" w:fill="E5EBF1"/>
             <w:tcBorders>
               <w:bottom w:val="single" w:sz="4" w:color="D0D5DD"/>
@@ -7048,7 +7048,7 @@
         </w:tc>
         <w:tc>
           <w:tcPr>
-            <w:tcW w:type="dxa" w:w="1247"/>
+            <w:tcW w:type="dxa" w:w="1304"/>
             <w:shd w:val="clear" w:color="auto" w:fill="E5EBF1"/>
             <w:tcBorders>
               <w:bottom w:val="single" w:sz="4" w:color="D0D5DD"/>
@@ -7074,7 +7074,7 @@
         </w:tc>
         <w:tc>
           <w:tcPr>
-            <w:tcW w:type="dxa" w:w="1247"/>
+            <w:tcW w:type="dxa" w:w="1304"/>
             <w:shd w:val="clear" w:color="auto" w:fill="E5EBF1"/>
             <w:tcBorders>
               <w:bottom w:val="single" w:sz="4" w:color="D0D5DD"/>
@@ -7100,7 +7100,7 @@
         </w:tc>
         <w:tc>
           <w:tcPr>
-            <w:tcW w:type="dxa" w:w="1134"/>
+            <w:tcW w:type="dxa" w:w="1191"/>
             <w:shd w:val="clear" w:color="auto" w:fill="E5EBF1"/>
             <w:tcBorders>
               <w:bottom w:val="single" w:sz="4" w:color="D0D5DD"/>
@@ -7126,7 +7126,7 @@
         </w:tc>
         <w:tc>
           <w:tcPr>
-            <w:tcW w:type="dxa" w:w="1247"/>
+            <w:tcW w:type="dxa" w:w="1304"/>
             <w:shd w:val="clear" w:color="auto" w:fill="E5EBF1"/>
             <w:tcBorders>
               <w:bottom w:val="single" w:sz="4" w:color="D0D5DD"/>
@@ -7203,12 +7203,12 @@
         <w:tblLook w:firstColumn="1" w:firstRow="1" w:lastColumn="0" w:lastRow="0" w:noHBand="0" w:noVBand="1" w:val="04A0"/>
       </w:tblPr>
       <w:tblGrid>
-        <w:gridCol w:w="907"/>
-        <w:gridCol w:w="2268"/>
+        <w:gridCol w:w="964"/>
+        <w:gridCol w:w="2381"/>
+        <w:gridCol w:w="1757"/>
+        <w:gridCol w:w="1644"/>
+        <w:gridCol w:w="1757"/>
         <w:gridCol w:w="1701"/>
-        <w:gridCol w:w="1587"/>
-        <w:gridCol w:w="1701"/>
-        <w:gridCol w:w="1587"/>
       </w:tblGrid>
       <w:tr>
         <w:trPr>
@@ -7216,7 +7216,7 @@
         </w:trPr>
         <w:tc>
           <w:tcPr>
-            <w:tcW w:type="dxa" w:w="907"/>
+            <w:tcW w:type="dxa" w:w="964"/>
             <w:shd w:val="clear" w:color="auto" w:fill="0A2342"/>
             <w:tcBorders>
               <w:top w:val="nil"/>
@@ -7251,7 +7251,7 @@
         </w:tc>
         <w:tc>
           <w:tcPr>
-            <w:tcW w:type="dxa" w:w="2268"/>
+            <w:tcW w:type="dxa" w:w="2381"/>
             <w:shd w:val="clear" w:color="auto" w:fill="0A2342"/>
             <w:tcBorders>
               <w:top w:val="nil"/>
@@ -7286,7 +7286,7 @@
         </w:tc>
         <w:tc>
           <w:tcPr>
-            <w:tcW w:type="dxa" w:w="1701"/>
+            <w:tcW w:type="dxa" w:w="1757"/>
             <w:shd w:val="clear" w:color="auto" w:fill="0A2342"/>
             <w:tcBorders>
               <w:top w:val="nil"/>
@@ -7322,7 +7322,7 @@
         </w:tc>
         <w:tc>
           <w:tcPr>
-            <w:tcW w:type="dxa" w:w="1587"/>
+            <w:tcW w:type="dxa" w:w="1644"/>
             <w:shd w:val="clear" w:color="auto" w:fill="0A2342"/>
             <w:tcBorders>
               <w:top w:val="nil"/>
@@ -7358,7 +7358,7 @@
         </w:tc>
         <w:tc>
           <w:tcPr>
-            <w:tcW w:type="dxa" w:w="1701"/>
+            <w:tcW w:type="dxa" w:w="1757"/>
             <w:shd w:val="clear" w:color="auto" w:fill="0A2342"/>
             <w:tcBorders>
               <w:top w:val="nil"/>
@@ -7394,7 +7394,7 @@
         </w:tc>
         <w:tc>
           <w:tcPr>
-            <w:tcW w:type="dxa" w:w="1587"/>
+            <w:tcW w:type="dxa" w:w="1701"/>
             <w:shd w:val="clear" w:color="auto" w:fill="0A2342"/>
             <w:tcBorders>
               <w:top w:val="nil"/>
@@ -7432,7 +7432,7 @@
       <w:tr>
         <w:tc>
           <w:tcPr>
-            <w:tcW w:type="dxa" w:w="907"/>
+            <w:tcW w:type="dxa" w:w="964"/>
             <w:tcBorders>
               <w:bottom w:val="single" w:sz="4" w:color="D0D5DD"/>
             </w:tcBorders>
@@ -7457,7 +7457,7 @@
         </w:tc>
         <w:tc>
           <w:tcPr>
-            <w:tcW w:type="dxa" w:w="2268"/>
+            <w:tcW w:type="dxa" w:w="2381"/>
             <w:tcBorders>
               <w:bottom w:val="single" w:sz="4" w:color="D0D5DD"/>
             </w:tcBorders>
@@ -7482,7 +7482,7 @@
         </w:tc>
         <w:tc>
           <w:tcPr>
-            <w:tcW w:type="dxa" w:w="1701"/>
+            <w:tcW w:type="dxa" w:w="1757"/>
             <w:tcBorders>
               <w:bottom w:val="single" w:sz="4" w:color="D0D5DD"/>
             </w:tcBorders>
@@ -7508,7 +7508,7 @@
         </w:tc>
         <w:tc>
           <w:tcPr>
-            <w:tcW w:type="dxa" w:w="1587"/>
+            <w:tcW w:type="dxa" w:w="1644"/>
             <w:tcBorders>
               <w:bottom w:val="single" w:sz="4" w:color="D0D5DD"/>
             </w:tcBorders>
@@ -7534,7 +7534,7 @@
         </w:tc>
         <w:tc>
           <w:tcPr>
-            <w:tcW w:type="dxa" w:w="1701"/>
+            <w:tcW w:type="dxa" w:w="1757"/>
             <w:tcBorders>
               <w:bottom w:val="single" w:sz="4" w:color="D0D5DD"/>
             </w:tcBorders>
@@ -7560,7 +7560,7 @@
         </w:tc>
         <w:tc>
           <w:tcPr>
-            <w:tcW w:type="dxa" w:w="1587"/>
+            <w:tcW w:type="dxa" w:w="1701"/>
             <w:tcBorders>
               <w:bottom w:val="single" w:sz="4" w:color="D0D5DD"/>
             </w:tcBorders>
@@ -7588,7 +7588,7 @@
       <w:tr>
         <w:tc>
           <w:tcPr>
-            <w:tcW w:type="dxa" w:w="907"/>
+            <w:tcW w:type="dxa" w:w="964"/>
             <w:shd w:val="clear" w:color="auto" w:fill="E5EBF1"/>
             <w:tcBorders>
               <w:bottom w:val="single" w:sz="4" w:color="D0D5DD"/>
@@ -7614,7 +7614,7 @@
         </w:tc>
         <w:tc>
           <w:tcPr>
-            <w:tcW w:type="dxa" w:w="2268"/>
+            <w:tcW w:type="dxa" w:w="2381"/>
             <w:shd w:val="clear" w:color="auto" w:fill="E5EBF1"/>
             <w:tcBorders>
               <w:bottom w:val="single" w:sz="4" w:color="D0D5DD"/>
@@ -7639,7 +7639,7 @@
         </w:tc>
         <w:tc>
           <w:tcPr>
-            <w:tcW w:type="dxa" w:w="1701"/>
+            <w:tcW w:type="dxa" w:w="1757"/>
             <w:shd w:val="clear" w:color="auto" w:fill="E5EBF1"/>
             <w:tcBorders>
               <w:bottom w:val="single" w:sz="4" w:color="D0D5DD"/>
@@ -7665,7 +7665,7 @@
         </w:tc>
         <w:tc>
           <w:tcPr>
-            <w:tcW w:type="dxa" w:w="1587"/>
+            <w:tcW w:type="dxa" w:w="1644"/>
             <w:shd w:val="clear" w:color="auto" w:fill="E5EBF1"/>
             <w:tcBorders>
               <w:bottom w:val="single" w:sz="4" w:color="D0D5DD"/>
@@ -7692,7 +7692,7 @@
         </w:tc>
         <w:tc>
           <w:tcPr>
-            <w:tcW w:type="dxa" w:w="1701"/>
+            <w:tcW w:type="dxa" w:w="1757"/>
             <w:shd w:val="clear" w:color="auto" w:fill="E5EBF1"/>
             <w:tcBorders>
               <w:bottom w:val="single" w:sz="4" w:color="D0D5DD"/>
@@ -7718,7 +7718,7 @@
         </w:tc>
         <w:tc>
           <w:tcPr>
-            <w:tcW w:type="dxa" w:w="1587"/>
+            <w:tcW w:type="dxa" w:w="1701"/>
             <w:shd w:val="clear" w:color="auto" w:fill="E5EBF1"/>
             <w:tcBorders>
               <w:bottom w:val="single" w:sz="4" w:color="D0D5DD"/>
@@ -7785,10 +7785,10 @@
         <w:tblLook w:firstColumn="1" w:firstRow="1" w:lastColumn="0" w:lastRow="0" w:noHBand="0" w:noVBand="1" w:val="04A0"/>
       </w:tblPr>
       <w:tblGrid>
-        <w:gridCol w:w="1587"/>
-        <w:gridCol w:w="2948"/>
-        <w:gridCol w:w="3628"/>
-        <w:gridCol w:w="1701"/>
+        <w:gridCol w:w="1644"/>
+        <w:gridCol w:w="3061"/>
+        <w:gridCol w:w="3742"/>
+        <w:gridCol w:w="1757"/>
       </w:tblGrid>
       <w:tr>
         <w:trPr>
@@ -7796,7 +7796,7 @@
         </w:trPr>
         <w:tc>
           <w:tcPr>
-            <w:tcW w:type="dxa" w:w="1587"/>
+            <w:tcW w:type="dxa" w:w="1644"/>
             <w:shd w:val="clear" w:color="auto" w:fill="0A2342"/>
             <w:tcBorders>
               <w:top w:val="nil"/>
@@ -7831,7 +7831,7 @@
         </w:tc>
         <w:tc>
           <w:tcPr>
-            <w:tcW w:type="dxa" w:w="2948"/>
+            <w:tcW w:type="dxa" w:w="3061"/>
             <w:shd w:val="clear" w:color="auto" w:fill="0A2342"/>
             <w:tcBorders>
               <w:top w:val="nil"/>
@@ -7866,7 +7866,7 @@
         </w:tc>
         <w:tc>
           <w:tcPr>
-            <w:tcW w:type="dxa" w:w="3628"/>
+            <w:tcW w:type="dxa" w:w="3742"/>
             <w:shd w:val="clear" w:color="auto" w:fill="0A2342"/>
             <w:tcBorders>
               <w:top w:val="nil"/>
@@ -7901,7 +7901,7 @@
         </w:tc>
         <w:tc>
           <w:tcPr>
-            <w:tcW w:type="dxa" w:w="1701"/>
+            <w:tcW w:type="dxa" w:w="1757"/>
             <w:shd w:val="clear" w:color="auto" w:fill="0A2342"/>
             <w:tcBorders>
               <w:top w:val="nil"/>
@@ -7939,7 +7939,7 @@
       <w:tr>
         <w:tc>
           <w:tcPr>
-            <w:tcW w:type="dxa" w:w="1587"/>
+            <w:tcW w:type="dxa" w:w="1644"/>
             <w:tcBorders>
               <w:bottom w:val="single" w:sz="4" w:color="D0D5DD"/>
             </w:tcBorders>
@@ -7964,7 +7964,7 @@
         </w:tc>
         <w:tc>
           <w:tcPr>
-            <w:tcW w:type="dxa" w:w="2948"/>
+            <w:tcW w:type="dxa" w:w="3061"/>
             <w:tcBorders>
               <w:bottom w:val="single" w:sz="4" w:color="D0D5DD"/>
             </w:tcBorders>
@@ -7989,7 +7989,7 @@
         </w:tc>
         <w:tc>
           <w:tcPr>
-            <w:tcW w:type="dxa" w:w="3628"/>
+            <w:tcW w:type="dxa" w:w="3742"/>
             <w:tcBorders>
               <w:bottom w:val="single" w:sz="4" w:color="D0D5DD"/>
             </w:tcBorders>
@@ -8014,7 +8014,7 @@
         </w:tc>
         <w:tc>
           <w:tcPr>
-            <w:tcW w:type="dxa" w:w="1701"/>
+            <w:tcW w:type="dxa" w:w="1757"/>
             <w:tcBorders>
               <w:bottom w:val="single" w:sz="4" w:color="D0D5DD"/>
             </w:tcBorders>
@@ -8042,7 +8042,7 @@
       <w:tr>
         <w:tc>
           <w:tcPr>
-            <w:tcW w:type="dxa" w:w="1587"/>
+            <w:tcW w:type="dxa" w:w="1644"/>
             <w:shd w:val="clear" w:color="auto" w:fill="F5F7FA"/>
             <w:tcBorders>
               <w:bottom w:val="single" w:sz="4" w:color="D0D5DD"/>
@@ -8068,7 +8068,7 @@
         </w:tc>
         <w:tc>
           <w:tcPr>
-            <w:tcW w:type="dxa" w:w="2948"/>
+            <w:tcW w:type="dxa" w:w="3061"/>
             <w:shd w:val="clear" w:color="auto" w:fill="F5F7FA"/>
             <w:tcBorders>
               <w:bottom w:val="single" w:sz="4" w:color="D0D5DD"/>
@@ -8094,7 +8094,7 @@
         </w:tc>
         <w:tc>
           <w:tcPr>
-            <w:tcW w:type="dxa" w:w="3628"/>
+            <w:tcW w:type="dxa" w:w="3742"/>
             <w:shd w:val="clear" w:color="auto" w:fill="F5F7FA"/>
             <w:tcBorders>
               <w:bottom w:val="single" w:sz="4" w:color="D0D5DD"/>
@@ -8120,7 +8120,7 @@
         </w:tc>
         <w:tc>
           <w:tcPr>
-            <w:tcW w:type="dxa" w:w="1701"/>
+            <w:tcW w:type="dxa" w:w="1757"/>
             <w:shd w:val="clear" w:color="auto" w:fill="F5F7FA"/>
             <w:tcBorders>
               <w:bottom w:val="single" w:sz="4" w:color="D0D5DD"/>
@@ -8149,7 +8149,7 @@
       <w:tr>
         <w:tc>
           <w:tcPr>
-            <w:tcW w:type="dxa" w:w="1587"/>
+            <w:tcW w:type="dxa" w:w="1644"/>
             <w:shd w:val="clear" w:color="auto" w:fill="E5EBF1"/>
             <w:tcBorders>
               <w:bottom w:val="single" w:sz="4" w:color="D0D5DD"/>
@@ -8175,7 +8175,7 @@
         </w:tc>
         <w:tc>
           <w:tcPr>
-            <w:tcW w:type="dxa" w:w="2948"/>
+            <w:tcW w:type="dxa" w:w="3061"/>
             <w:shd w:val="clear" w:color="auto" w:fill="E5EBF1"/>
             <w:tcBorders>
               <w:bottom w:val="single" w:sz="4" w:color="D0D5DD"/>
@@ -8200,7 +8200,7 @@
         </w:tc>
         <w:tc>
           <w:tcPr>
-            <w:tcW w:type="dxa" w:w="3628"/>
+            <w:tcW w:type="dxa" w:w="3742"/>
             <w:shd w:val="clear" w:color="auto" w:fill="E5EBF1"/>
             <w:tcBorders>
               <w:bottom w:val="single" w:sz="4" w:color="D0D5DD"/>
@@ -8225,7 +8225,7 @@
         </w:tc>
         <w:tc>
           <w:tcPr>
-            <w:tcW w:type="dxa" w:w="1701"/>
+            <w:tcW w:type="dxa" w:w="1757"/>
             <w:shd w:val="clear" w:color="auto" w:fill="E5EBF1"/>
             <w:tcBorders>
               <w:bottom w:val="single" w:sz="4" w:color="D0D5DD"/>
@@ -8256,7 +8256,7 @@
       <w:pPr>
         <w:sectPr>
           <w:pgSz w:w="11906" w:h="16838"/>
-          <w:pgMar w:top="1134" w:right="1020" w:bottom="1134" w:left="1020" w:header="720" w:footer="720" w:gutter="0"/>
+          <w:pgMar w:top="1134" w:right="850" w:bottom="1134" w:left="850" w:header="720" w:footer="720" w:gutter="0"/>
           <w:cols w:space="720"/>
           <w:docGrid w:linePitch="360"/>
         </w:sectPr>
@@ -8342,7 +8342,7 @@
     </w:p>
     <w:sectPr>
       <w:pgSz w:w="11906" w:h="16838"/>
-      <w:pgMar w:top="1134" w:right="1020" w:bottom="1134" w:left="1020" w:header="720" w:footer="720" w:gutter="0"/>
+      <w:pgMar w:top="1134" w:right="850" w:bottom="1134" w:left="850" w:header="720" w:footer="720" w:gutter="0"/>
       <w:cols w:space="720"/>
       <w:docGrid w:linePitch="360"/>
     </w:sectPr>

</xml_diff>